<commit_message>
feat :add SKRD STRD Variable
</commit_message>
<xml_diff>
--- a/rusun-backend/app/templates/template_skrd.docx
+++ b/rusun-backend/app/templates/template_skrd.docx
@@ -1,6 +1,6 @@
 
 <file path=word/document.xml><?xml version="1.0" encoding="utf-8"?>
-<w:document xmlns:wpc="http://schemas.microsoft.com/office/word/2010/wordprocessingCanvas" xmlns:cx="http://schemas.microsoft.com/office/drawing/2014/chartex" xmlns:cx1="http://schemas.microsoft.com/office/drawing/2015/9/8/chartex" xmlns:cx2="http://schemas.microsoft.com/office/drawing/2015/10/21/chartex" xmlns:cx3="http://schemas.microsoft.com/office/drawing/2016/5/9/chartex" xmlns:cx4="http://schemas.microsoft.com/office/drawing/2016/5/10/chartex" xmlns:cx5="http://schemas.microsoft.com/office/drawing/2016/5/11/chartex" xmlns:cx6="http://schemas.microsoft.com/office/drawing/2016/5/12/chartex" xmlns:cx7="http://schemas.microsoft.com/office/drawing/2016/5/13/chartex" xmlns:cx8="http://schemas.microsoft.com/office/drawing/2016/5/14/chartex" xmlns:mc="http://schemas.openxmlformats.org/markup-compatibility/2006" xmlns:aink="http://schemas.microsoft.com/office/drawing/2016/ink" xmlns:am3d="http://schemas.microsoft.com/office/drawing/2017/model3d" xmlns:o="urn:schemas-microsoft-com:office:office" xmlns:oel="http://schemas.microsoft.com/office/2019/extlst" xmlns:r="http://schemas.openxmlformats.org/officeDocument/2006/relationships" xmlns:m="http://schemas.openxmlformats.org/officeDocument/2006/math" xmlns:v="urn:schemas-microsoft-com:vml" xmlns:wp14="http://schemas.microsoft.com/office/word/2010/wordprocessingDrawing" xmlns:wp="http://schemas.openxmlformats.org/drawingml/2006/wordprocessingDrawing" xmlns:w10="urn:schemas-microsoft-com:office:word" xmlns:w="http://schemas.openxmlformats.org/wordprocessingml/2006/main" xmlns:w14="http://schemas.microsoft.com/office/word/2010/wordml" xmlns:w15="http://schemas.microsoft.com/office/word/2012/wordml" xmlns:w16cex="http://schemas.microsoft.com/office/word/2018/wordml/cex" xmlns:w16cid="http://schemas.microsoft.com/office/word/2016/wordml/cid" xmlns:w16="http://schemas.microsoft.com/office/word/2018/wordml" xmlns:w16du="http://schemas.microsoft.com/office/word/2023/wordml/word16du" xmlns:w16sdtdh="http://schemas.microsoft.com/office/word/2020/wordml/sdtdatahash" xmlns:w16sdtfl="http://schemas.microsoft.com/office/word/2024/wordml/sdtformatlock" xmlns:w16se="http://schemas.microsoft.com/office/word/2015/wordml/symex" xmlns:wpg="http://schemas.microsoft.com/office/word/2010/wordprocessingGroup" xmlns:wpi="http://schemas.microsoft.com/office/word/2010/wordprocessingInk" xmlns:wne="http://schemas.microsoft.com/office/word/2006/wordml" xmlns:wps="http://schemas.microsoft.com/office/word/2010/wordprocessingShape" mc:Ignorable="w14 w15 w16se w16cid w16 w16cex w16sdtdh w16sdtfl w16du wp14">
+<w:document xmlns:wpc="http://schemas.microsoft.com/office/word/2010/wordprocessingCanvas" xmlns:cx="http://schemas.microsoft.com/office/drawing/2014/chartex" xmlns:cx1="http://schemas.microsoft.com/office/drawing/2015/9/8/chartex" xmlns:cx2="http://schemas.microsoft.com/office/drawing/2015/10/21/chartex" xmlns:cx3="http://schemas.microsoft.com/office/drawing/2016/5/9/chartex" xmlns:cx4="http://schemas.microsoft.com/office/drawing/2016/5/10/chartex" xmlns:cx5="http://schemas.microsoft.com/office/drawing/2016/5/11/chartex" xmlns:cx6="http://schemas.microsoft.com/office/drawing/2016/5/12/chartex" xmlns:cx7="http://schemas.microsoft.com/office/drawing/2016/5/13/chartex" xmlns:cx8="http://schemas.microsoft.com/office/drawing/2016/5/14/chartex" xmlns:mc="http://schemas.openxmlformats.org/markup-compatibility/2006" xmlns:aink="http://schemas.microsoft.com/office/drawing/2016/ink" xmlns:am3d="http://schemas.microsoft.com/office/drawing/2017/model3d" xmlns:o="urn:schemas-microsoft-com:office:office" xmlns:r="http://schemas.openxmlformats.org/officeDocument/2006/relationships" xmlns:m="http://schemas.openxmlformats.org/officeDocument/2006/math" xmlns:v="urn:schemas-microsoft-com:vml" xmlns:wp14="http://schemas.microsoft.com/office/word/2010/wordprocessingDrawing" xmlns:wp="http://schemas.openxmlformats.org/drawingml/2006/wordprocessingDrawing" xmlns:w10="urn:schemas-microsoft-com:office:word" xmlns:w="http://schemas.openxmlformats.org/wordprocessingml/2006/main" xmlns:w14="http://schemas.microsoft.com/office/word/2010/wordml" xmlns:w15="http://schemas.microsoft.com/office/word/2012/wordml" xmlns:w16cex="http://schemas.microsoft.com/office/word/2018/wordml/cex" xmlns:w16cid="http://schemas.microsoft.com/office/word/2016/wordml/cid" xmlns:w16="http://schemas.microsoft.com/office/word/2018/wordml" xmlns:w16sdtdh="http://schemas.microsoft.com/office/word/2020/wordml/sdtdatahash" xmlns:w16se="http://schemas.microsoft.com/office/word/2015/wordml/symex" xmlns:wpg="http://schemas.microsoft.com/office/word/2010/wordprocessingGroup" xmlns:wpi="http://schemas.microsoft.com/office/word/2010/wordprocessingInk" xmlns:wne="http://schemas.microsoft.com/office/word/2006/wordml" xmlns:wps="http://schemas.microsoft.com/office/word/2010/wordprocessingShape" mc:Ignorable="w14 w15 w16se w16cid w16 w16cex w16sdtdh wp14">
   <w:body>
     <w:p>
       <w:pPr>
@@ -48,7 +48,7 @@
           <v:shape id="_x0000_s1057" type="#_x0000_t75" style="position:absolute;left:0;text-align:left;margin-left:44.5pt;margin-top:-51.8pt;width:63.55pt;height:66pt;z-index:251659264;visibility:visible;mso-wrap-style:tight;mso-wrap-edited:f">
             <v:imagedata r:id="rId8" o:title=""/>
           </v:shape>
-          <o:OLEObject Type="Embed" ProgID="Word.Picture.8" ShapeID="_x0000_s1057" DrawAspect="Content" ObjectID="_1837145906" r:id="rId9"/>
+          <o:OLEObject Type="Embed" ProgID="Word.Picture.8" ShapeID="_x0000_s1057" DrawAspect="Content" ObjectID="_1837187317" r:id="rId9"/>
         </w:object>
       </w:r>
       <w:r>
@@ -66,7 +66,7 @@
           <v:shape id="_x0000_s1052" type="#_x0000_t75" style="position:absolute;left:0;text-align:left;margin-left:44.5pt;margin-top:-64.8pt;width:480.6pt;height:85.7pt;z-index:251655168" filled="t">
             <v:imagedata r:id="rId10" o:title=""/>
           </v:shape>
-          <o:OLEObject Type="Embed" ProgID="Word.Document.12" ShapeID="_x0000_s1052" DrawAspect="Content" ObjectID="_1837145907" r:id="rId11"/>
+          <o:OLEObject Type="Embed" ProgID="Word.Document.12" ShapeID="_x0000_s1052" DrawAspect="Content" ObjectID="_1837187318" r:id="rId11"/>
         </w:object>
       </w:r>
       <w:r>
@@ -155,7 +155,6 @@
           <w:szCs w:val="22"/>
         </w:rPr>
       </w:pPr>
-      <w:proofErr w:type="gramStart"/>
       <w:r>
         <w:rPr>
           <w:rFonts w:ascii="Tahoma" w:hAnsi="Tahoma" w:cs="Tahoma"/>
@@ -165,21 +164,8 @@
           <w:sz w:val="22"/>
           <w:szCs w:val="22"/>
         </w:rPr>
-        <w:t>Nomor :</w:t>
-      </w:r>
-      <w:proofErr w:type="gramEnd"/>
-      <w:r>
-        <w:rPr>
-          <w:rFonts w:ascii="Tahoma" w:hAnsi="Tahoma" w:cs="Tahoma"/>
-          <w:b w:val="0"/>
-          <w:bCs w:val="0"/>
-          <w:color w:val="000000"/>
-          <w:sz w:val="22"/>
-          <w:szCs w:val="22"/>
-        </w:rPr>
-        <w:t xml:space="preserve"> </w:t>
-      </w:r>
-      <w:proofErr w:type="gramStart"/>
+        <w:t xml:space="preserve">Nomor : </w:t>
+      </w:r>
       <w:r>
         <w:rPr>
           <w:rFonts w:ascii="Tahoma" w:hAnsi="Tahoma" w:cs="Tahoma"/>
@@ -190,46 +176,7 @@
           <w:szCs w:val="22"/>
           <w:lang w:val="id-ID"/>
         </w:rPr>
-        <w:t>{{ nomor</w:t>
-      </w:r>
-      <w:proofErr w:type="gramEnd"/>
-      <w:r>
-        <w:rPr>
-          <w:rFonts w:ascii="Tahoma" w:hAnsi="Tahoma" w:cs="Tahoma"/>
-          <w:b w:val="0"/>
-          <w:bCs w:val="0"/>
-          <w:color w:val="000000"/>
-          <w:sz w:val="22"/>
-          <w:szCs w:val="22"/>
-          <w:lang w:val="id-ID"/>
-        </w:rPr>
-        <w:t>_</w:t>
-      </w:r>
-      <w:proofErr w:type="gramStart"/>
-      <w:r>
-        <w:rPr>
-          <w:rFonts w:ascii="Tahoma" w:hAnsi="Tahoma" w:cs="Tahoma"/>
-          <w:b w:val="0"/>
-          <w:bCs w:val="0"/>
-          <w:color w:val="000000"/>
-          <w:sz w:val="22"/>
-          <w:szCs w:val="22"/>
-          <w:lang w:val="id-ID"/>
-        </w:rPr>
-        <w:t>surat }</w:t>
-      </w:r>
-      <w:proofErr w:type="gramEnd"/>
-      <w:r>
-        <w:rPr>
-          <w:rFonts w:ascii="Tahoma" w:hAnsi="Tahoma" w:cs="Tahoma"/>
-          <w:b w:val="0"/>
-          <w:bCs w:val="0"/>
-          <w:color w:val="000000"/>
-          <w:sz w:val="22"/>
-          <w:szCs w:val="22"/>
-          <w:lang w:val="id-ID"/>
-        </w:rPr>
-        <w:t>}</w:t>
+        <w:t>{{ nomor_surat }}</w:t>
       </w:r>
     </w:p>
     <w:p>
@@ -271,7 +218,6 @@
         <w:tab/>
         <w:t xml:space="preserve">: </w:t>
       </w:r>
-      <w:proofErr w:type="gramStart"/>
       <w:r>
         <w:rPr>
           <w:rFonts w:ascii="Tahoma" w:hAnsi="Tahoma" w:cs="Tahoma"/>
@@ -279,37 +225,7 @@
           <w:sz w:val="18"/>
           <w:szCs w:val="20"/>
         </w:rPr>
-        <w:t>{{ id</w:t>
-      </w:r>
-      <w:proofErr w:type="gramEnd"/>
-      <w:r>
-        <w:rPr>
-          <w:rFonts w:ascii="Tahoma" w:hAnsi="Tahoma" w:cs="Tahoma"/>
-          <w:color w:val="000000"/>
-          <w:sz w:val="18"/>
-          <w:szCs w:val="20"/>
-        </w:rPr>
-        <w:t>_</w:t>
-      </w:r>
-      <w:proofErr w:type="gramStart"/>
-      <w:r>
-        <w:rPr>
-          <w:rFonts w:ascii="Tahoma" w:hAnsi="Tahoma" w:cs="Tahoma"/>
-          <w:color w:val="000000"/>
-          <w:sz w:val="18"/>
-          <w:szCs w:val="20"/>
-        </w:rPr>
-        <w:t>penghuni }</w:t>
-      </w:r>
-      <w:proofErr w:type="gramEnd"/>
-      <w:r>
-        <w:rPr>
-          <w:rFonts w:ascii="Tahoma" w:hAnsi="Tahoma" w:cs="Tahoma"/>
-          <w:color w:val="000000"/>
-          <w:sz w:val="18"/>
-          <w:szCs w:val="20"/>
-        </w:rPr>
-        <w:t>}</w:t>
+        <w:t>{{ id_penghuni }}</w:t>
       </w:r>
     </w:p>
     <w:p>
@@ -369,7 +285,6 @@
         </w:rPr>
         <w:t xml:space="preserve"> </w:t>
       </w:r>
-      <w:proofErr w:type="gramStart"/>
       <w:r>
         <w:rPr>
           <w:rFonts w:ascii="Tahoma" w:hAnsi="Tahoma" w:cs="Tahoma"/>
@@ -377,17 +292,7 @@
           <w:sz w:val="18"/>
           <w:szCs w:val="20"/>
         </w:rPr>
-        <w:t>{{ nama</w:t>
-      </w:r>
-      <w:proofErr w:type="gramEnd"/>
-      <w:r>
-        <w:rPr>
-          <w:rFonts w:ascii="Tahoma" w:hAnsi="Tahoma" w:cs="Tahoma"/>
-          <w:color w:val="000000"/>
-          <w:sz w:val="18"/>
-          <w:szCs w:val="20"/>
-        </w:rPr>
-        <w:t xml:space="preserve"> }}</w:t>
+        <w:t>{{ nama }}</w:t>
       </w:r>
     </w:p>
     <w:p>
@@ -437,7 +342,6 @@
         </w:rPr>
         <w:t xml:space="preserve"> </w:t>
       </w:r>
-      <w:proofErr w:type="gramStart"/>
       <w:r>
         <w:rPr>
           <w:rFonts w:ascii="Tahoma" w:hAnsi="Tahoma" w:cs="Tahoma"/>
@@ -445,37 +349,7 @@
           <w:sz w:val="18"/>
           <w:szCs w:val="20"/>
         </w:rPr>
-        <w:t>{{ alamat</w:t>
-      </w:r>
-      <w:proofErr w:type="gramEnd"/>
-      <w:r>
-        <w:rPr>
-          <w:rFonts w:ascii="Tahoma" w:hAnsi="Tahoma" w:cs="Tahoma"/>
-          <w:color w:val="000000"/>
-          <w:sz w:val="18"/>
-          <w:szCs w:val="20"/>
-        </w:rPr>
-        <w:t>_</w:t>
-      </w:r>
-      <w:proofErr w:type="gramStart"/>
-      <w:r>
-        <w:rPr>
-          <w:rFonts w:ascii="Tahoma" w:hAnsi="Tahoma" w:cs="Tahoma"/>
-          <w:color w:val="000000"/>
-          <w:sz w:val="18"/>
-          <w:szCs w:val="20"/>
-        </w:rPr>
-        <w:t>hunian }</w:t>
-      </w:r>
-      <w:proofErr w:type="gramEnd"/>
-      <w:r>
-        <w:rPr>
-          <w:rFonts w:ascii="Tahoma" w:hAnsi="Tahoma" w:cs="Tahoma"/>
-          <w:color w:val="000000"/>
-          <w:sz w:val="18"/>
-          <w:szCs w:val="20"/>
-        </w:rPr>
-        <w:t>}</w:t>
+        <w:t>{{ alamat_hunian }}</w:t>
       </w:r>
     </w:p>
     <w:p>
@@ -525,7 +399,6 @@
         </w:rPr>
         <w:t xml:space="preserve"> </w:t>
       </w:r>
-      <w:proofErr w:type="gramStart"/>
       <w:r>
         <w:rPr>
           <w:rFonts w:ascii="Tahoma" w:hAnsi="Tahoma" w:cs="Tahoma"/>
@@ -533,17 +406,7 @@
           <w:sz w:val="18"/>
           <w:szCs w:val="20"/>
         </w:rPr>
-        <w:t>{{ rusunawa</w:t>
-      </w:r>
-      <w:proofErr w:type="gramEnd"/>
-      <w:r>
-        <w:rPr>
-          <w:rFonts w:ascii="Tahoma" w:hAnsi="Tahoma" w:cs="Tahoma"/>
-          <w:color w:val="000000"/>
-          <w:sz w:val="18"/>
-          <w:szCs w:val="20"/>
-        </w:rPr>
-        <w:t xml:space="preserve"> }}</w:t>
+        <w:t>{{ rusunawa }}</w:t>
       </w:r>
       <w:r>
         <w:rPr>
@@ -631,19 +494,8 @@
           <w:sz w:val="20"/>
           <w:szCs w:val="20"/>
         </w:rPr>
-        <w:t xml:space="preserve">Dengan rincian sebagai </w:t>
-      </w:r>
-      <w:proofErr w:type="gramStart"/>
-      <w:r>
-        <w:rPr>
-          <w:rFonts w:ascii="Tahoma" w:hAnsi="Tahoma" w:cs="Tahoma"/>
-          <w:color w:val="000000"/>
-          <w:sz w:val="20"/>
-          <w:szCs w:val="20"/>
-        </w:rPr>
-        <w:t>berikut :</w:t>
-      </w:r>
-      <w:proofErr w:type="gramEnd"/>
+        <w:t>Dengan rincian sebagai berikut :</w:t>
+      </w:r>
     </w:p>
     <w:tbl>
       <w:tblPr>
@@ -833,7 +685,6 @@
               </w:rPr>
               <w:t xml:space="preserve">Bulan </w:t>
             </w:r>
-            <w:proofErr w:type="gramStart"/>
             <w:r>
               <w:rPr>
                 <w:rFonts w:ascii="Tahoma" w:hAnsi="Tahoma" w:cs="Tahoma"/>
@@ -844,9 +695,8 @@
                 <w:szCs w:val="20"/>
                 <w:lang w:val="en-US"/>
               </w:rPr>
-              <w:t>{{ bulan</w:t>
-            </w:r>
-            <w:proofErr w:type="gramEnd"/>
+              <w:t>{{ bulan_tagihan }}</w:t>
+            </w:r>
             <w:r>
               <w:rPr>
                 <w:rFonts w:ascii="Tahoma" w:hAnsi="Tahoma" w:cs="Tahoma"/>
@@ -857,9 +707,8 @@
                 <w:szCs w:val="20"/>
                 <w:lang w:val="en-US"/>
               </w:rPr>
-              <w:t>_</w:t>
-            </w:r>
-            <w:proofErr w:type="gramStart"/>
+              <w:t xml:space="preserve"> </w:t>
+            </w:r>
             <w:r>
               <w:rPr>
                 <w:rFonts w:ascii="Tahoma" w:hAnsi="Tahoma" w:cs="Tahoma"/>
@@ -870,58 +719,7 @@
                 <w:szCs w:val="20"/>
                 <w:lang w:val="en-US"/>
               </w:rPr>
-              <w:t>tagihan }</w:t>
-            </w:r>
-            <w:proofErr w:type="gramEnd"/>
-            <w:r>
-              <w:rPr>
-                <w:rFonts w:ascii="Tahoma" w:hAnsi="Tahoma" w:cs="Tahoma"/>
-                <w:b/>
-                <w:iCs/>
-                <w:color w:val="000000"/>
-                <w:sz w:val="18"/>
-                <w:szCs w:val="20"/>
-                <w:lang w:val="en-US"/>
-              </w:rPr>
-              <w:t>}</w:t>
-            </w:r>
-            <w:r>
-              <w:rPr>
-                <w:rFonts w:ascii="Tahoma" w:hAnsi="Tahoma" w:cs="Tahoma"/>
-                <w:b/>
-                <w:iCs/>
-                <w:color w:val="000000"/>
-                <w:sz w:val="18"/>
-                <w:szCs w:val="20"/>
-                <w:lang w:val="en-US"/>
-              </w:rPr>
-              <w:t xml:space="preserve"> </w:t>
-            </w:r>
-            <w:proofErr w:type="gramStart"/>
-            <w:r>
-              <w:rPr>
-                <w:rFonts w:ascii="Tahoma" w:hAnsi="Tahoma" w:cs="Tahoma"/>
-                <w:b/>
-                <w:iCs/>
-                <w:color w:val="000000"/>
-                <w:sz w:val="18"/>
-                <w:szCs w:val="20"/>
-                <w:lang w:val="en-US"/>
-              </w:rPr>
-              <w:t>{{ tahun</w:t>
-            </w:r>
-            <w:proofErr w:type="gramEnd"/>
-            <w:r>
-              <w:rPr>
-                <w:rFonts w:ascii="Tahoma" w:hAnsi="Tahoma" w:cs="Tahoma"/>
-                <w:b/>
-                <w:iCs/>
-                <w:color w:val="000000"/>
-                <w:sz w:val="18"/>
-                <w:szCs w:val="20"/>
-                <w:lang w:val="en-US"/>
-              </w:rPr>
-              <w:t>_tagihan }}</w:t>
+              <w:t>{{ tahun_tagihan }}</w:t>
             </w:r>
           </w:p>
         </w:tc>
@@ -959,7 +757,6 @@
               </w:rPr>
               <w:t xml:space="preserve"> </w:t>
             </w:r>
-            <w:proofErr w:type="gramStart"/>
             <w:r>
               <w:rPr>
                 <w:rFonts w:ascii="Tahoma" w:hAnsi="Tahoma" w:cs="Tahoma"/>
@@ -968,18 +765,7 @@
                 <w:sz w:val="18"/>
                 <w:szCs w:val="20"/>
               </w:rPr>
-              <w:t>{{ sewa</w:t>
-            </w:r>
-            <w:proofErr w:type="gramEnd"/>
-            <w:r>
-              <w:rPr>
-                <w:rFonts w:ascii="Tahoma" w:hAnsi="Tahoma" w:cs="Tahoma"/>
-                <w:i/>
-                <w:color w:val="000000"/>
-                <w:sz w:val="18"/>
-                <w:szCs w:val="20"/>
-              </w:rPr>
-              <w:t>_price }}</w:t>
+              <w:t>{{ sewa_price }}</w:t>
             </w:r>
           </w:p>
         </w:tc>
@@ -1063,7 +849,6 @@
               </w:rPr>
               <w:t xml:space="preserve">Rp. </w:t>
             </w:r>
-            <w:proofErr w:type="gramStart"/>
             <w:r>
               <w:rPr>
                 <w:rFonts w:ascii="Tahoma" w:hAnsi="Tahoma" w:cs="Tahoma"/>
@@ -1072,18 +857,7 @@
                 <w:sz w:val="18"/>
                 <w:szCs w:val="20"/>
               </w:rPr>
-              <w:t>{{ parking</w:t>
-            </w:r>
-            <w:proofErr w:type="gramEnd"/>
-            <w:r>
-              <w:rPr>
-                <w:rFonts w:ascii="Tahoma" w:hAnsi="Tahoma" w:cs="Tahoma"/>
-                <w:i/>
-                <w:color w:val="000000"/>
-                <w:sz w:val="18"/>
-                <w:szCs w:val="20"/>
-              </w:rPr>
-              <w:t>_price }}</w:t>
+              <w:t>{{ parking_price }}</w:t>
             </w:r>
           </w:p>
         </w:tc>
@@ -1253,7 +1027,6 @@
               </w:rPr>
               <w:t xml:space="preserve"> </w:t>
             </w:r>
-            <w:proofErr w:type="gramStart"/>
             <w:r>
               <w:rPr>
                 <w:rFonts w:ascii="Tahoma" w:hAnsi="Tahoma" w:cs="Tahoma"/>
@@ -1263,19 +1036,7 @@
                 <w:sz w:val="18"/>
                 <w:szCs w:val="20"/>
               </w:rPr>
-              <w:t>{{ total</w:t>
-            </w:r>
-            <w:proofErr w:type="gramEnd"/>
-            <w:r>
-              <w:rPr>
-                <w:rFonts w:ascii="Tahoma" w:hAnsi="Tahoma" w:cs="Tahoma"/>
-                <w:b/>
-                <w:i/>
-                <w:color w:val="000000"/>
-                <w:sz w:val="18"/>
-                <w:szCs w:val="20"/>
-              </w:rPr>
-              <w:t>_price }}</w:t>
+              <w:t>{{ total_price }}</w:t>
             </w:r>
           </w:p>
         </w:tc>
@@ -1361,7 +1122,7 @@
               </wp:anchor>
             </w:drawing>
           </mc:Choice>
-          <mc:Fallback>
+          <mc:Fallback xmlns:w16sdtfl="http://schemas.microsoft.com/office/word/2024/wordml/sdtformatlock" xmlns:w16du="http://schemas.microsoft.com/office/word/2023/wordml/word16du" xmlns:oel="http://schemas.microsoft.com/office/2019/extlst">
             <w:pict>
               <v:rect w14:anchorId="0F72614D" id="Rectangle 32" o:spid="_x0000_s1026" style="position:absolute;margin-left:90.25pt;margin-top:8.5pt;width:382.2pt;height:20.45pt;z-index:-251658240;visibility:visible;mso-wrap-style:square;mso-width-percent:0;mso-height-percent:0;mso-wrap-distance-left:9pt;mso-wrap-distance-top:0;mso-wrap-distance-right:9pt;mso-wrap-distance-bottom:0;mso-position-horizontal:absolute;mso-position-horizontal-relative:text;mso-position-vertical:absolute;mso-position-vertical-relative:text;mso-width-percent:0;mso-height-percent:0;mso-width-relative:page;mso-height-relative:page;v-text-anchor:top" o:gfxdata="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"/>
             </w:pict>
@@ -1387,18 +1148,16 @@
           <w:sz w:val="18"/>
           <w:szCs w:val="20"/>
         </w:rPr>
-        <w:t xml:space="preserve">Dengan </w:t>
-      </w:r>
-      <w:proofErr w:type="gramStart"/>
-      <w:r>
-        <w:rPr>
-          <w:rFonts w:ascii="Tahoma" w:hAnsi="Tahoma" w:cs="Tahoma"/>
-          <w:i/>
+        <w:t>Dengan huruf</w:t>
+      </w:r>
+      <w:r>
+        <w:rPr>
+          <w:rFonts w:ascii="Tahoma" w:hAnsi="Tahoma" w:cs="Tahoma"/>
           <w:color w:val="000000"/>
           <w:sz w:val="18"/>
           <w:szCs w:val="20"/>
         </w:rPr>
-        <w:t>huruf</w:t>
+        <w:t xml:space="preserve"> : </w:t>
       </w:r>
       <w:r>
         <w:rPr>
@@ -1407,28 +1166,8 @@
           <w:sz w:val="18"/>
           <w:szCs w:val="20"/>
         </w:rPr>
-        <w:t xml:space="preserve"> :</w:t>
-      </w:r>
-      <w:proofErr w:type="gramEnd"/>
-      <w:r>
-        <w:rPr>
-          <w:rFonts w:ascii="Tahoma" w:hAnsi="Tahoma" w:cs="Tahoma"/>
-          <w:color w:val="000000"/>
-          <w:sz w:val="18"/>
-          <w:szCs w:val="20"/>
-        </w:rPr>
-        <w:t xml:space="preserve"> </w:t>
-      </w:r>
-      <w:r>
-        <w:rPr>
-          <w:rFonts w:ascii="Tahoma" w:hAnsi="Tahoma" w:cs="Tahoma"/>
-          <w:color w:val="000000"/>
-          <w:sz w:val="18"/>
-          <w:szCs w:val="20"/>
-        </w:rPr>
         <w:t xml:space="preserve">  </w:t>
       </w:r>
-      <w:proofErr w:type="gramStart"/>
       <w:r>
         <w:rPr>
           <w:rFonts w:ascii="Tahoma" w:hAnsi="Tahoma" w:cs="Tahoma"/>
@@ -1437,40 +1176,7 @@
           <w:sz w:val="20"/>
           <w:szCs w:val="20"/>
         </w:rPr>
-        <w:t>{{ total</w:t>
-      </w:r>
-      <w:proofErr w:type="gramEnd"/>
-      <w:r>
-        <w:rPr>
-          <w:rFonts w:ascii="Tahoma" w:hAnsi="Tahoma" w:cs="Tahoma"/>
-          <w:b/>
-          <w:color w:val="000000"/>
-          <w:sz w:val="20"/>
-          <w:szCs w:val="20"/>
-        </w:rPr>
-        <w:t>_price_</w:t>
-      </w:r>
-      <w:proofErr w:type="gramStart"/>
-      <w:r>
-        <w:rPr>
-          <w:rFonts w:ascii="Tahoma" w:hAnsi="Tahoma" w:cs="Tahoma"/>
-          <w:b/>
-          <w:color w:val="000000"/>
-          <w:sz w:val="20"/>
-          <w:szCs w:val="20"/>
-        </w:rPr>
-        <w:t>words }</w:t>
-      </w:r>
-      <w:proofErr w:type="gramEnd"/>
-      <w:r>
-        <w:rPr>
-          <w:rFonts w:ascii="Tahoma" w:hAnsi="Tahoma" w:cs="Tahoma"/>
-          <w:b/>
-          <w:color w:val="000000"/>
-          <w:sz w:val="20"/>
-          <w:szCs w:val="20"/>
-        </w:rPr>
-        <w:t>}</w:t>
+        <w:t>{{ total_price_words }}</w:t>
       </w:r>
     </w:p>
     <w:p>
@@ -1533,7 +1239,6 @@
                 <w:szCs w:val="16"/>
               </w:rPr>
             </w:pPr>
-            <w:proofErr w:type="gramStart"/>
             <w:r>
               <w:rPr>
                 <w:rFonts w:ascii="Tahoma" w:hAnsi="Tahoma" w:cs="Tahoma"/>
@@ -1544,7 +1249,6 @@
               </w:rPr>
               <w:t>Catatan :</w:t>
             </w:r>
-            <w:proofErr w:type="gramEnd"/>
           </w:p>
           <w:p>
             <w:pPr>
@@ -1796,121 +1500,17 @@
               </w:rPr>
               <w:t xml:space="preserve"> </w:t>
             </w:r>
-            <w:proofErr w:type="gramStart"/>
-            <w:r>
-              <w:rPr>
-                <w:rFonts w:ascii="Tahoma" w:hAnsi="Tahoma" w:cs="Tahoma"/>
-                <w:b/>
+            <w:r>
+              <w:rPr>
+                <w:rFonts w:ascii="Tahoma" w:hAnsi="Tahoma" w:cs="Tahoma"/>
+                <w:bCs/>
                 <w:iCs/>
                 <w:color w:val="000000"/>
                 <w:sz w:val="18"/>
                 <w:szCs w:val="20"/>
                 <w:lang w:val="en-US"/>
               </w:rPr>
-              <w:t>{{ bulan</w:t>
-            </w:r>
-            <w:proofErr w:type="gramEnd"/>
-            <w:r>
-              <w:rPr>
-                <w:rFonts w:ascii="Tahoma" w:hAnsi="Tahoma" w:cs="Tahoma"/>
-                <w:b/>
-                <w:iCs/>
-                <w:color w:val="000000"/>
-                <w:sz w:val="18"/>
-                <w:szCs w:val="20"/>
-                <w:lang w:val="en-US"/>
-              </w:rPr>
-              <w:t>_</w:t>
-            </w:r>
-            <w:proofErr w:type="gramStart"/>
-            <w:r>
-              <w:rPr>
-                <w:rFonts w:ascii="Tahoma" w:hAnsi="Tahoma" w:cs="Tahoma"/>
-                <w:b/>
-                <w:iCs/>
-                <w:color w:val="000000"/>
-                <w:sz w:val="18"/>
-                <w:szCs w:val="20"/>
-                <w:lang w:val="en-US"/>
-              </w:rPr>
-              <w:t>tagihan }</w:t>
-            </w:r>
-            <w:proofErr w:type="gramEnd"/>
-            <w:r>
-              <w:rPr>
-                <w:rFonts w:ascii="Tahoma" w:hAnsi="Tahoma" w:cs="Tahoma"/>
-                <w:b/>
-                <w:iCs/>
-                <w:color w:val="000000"/>
-                <w:sz w:val="18"/>
-                <w:szCs w:val="20"/>
-                <w:lang w:val="en-US"/>
-              </w:rPr>
-              <w:t>}</w:t>
-            </w:r>
-            <w:r>
-              <w:rPr>
-                <w:rFonts w:ascii="Tahoma" w:hAnsi="Tahoma" w:cs="Tahoma"/>
-                <w:b/>
-                <w:iCs/>
-                <w:color w:val="000000"/>
-                <w:sz w:val="18"/>
-                <w:szCs w:val="20"/>
-                <w:lang w:val="en-US"/>
-              </w:rPr>
-              <w:t xml:space="preserve"> </w:t>
-            </w:r>
-            <w:proofErr w:type="gramStart"/>
-            <w:r>
-              <w:rPr>
-                <w:rFonts w:ascii="Tahoma" w:hAnsi="Tahoma" w:cs="Tahoma"/>
-                <w:b/>
-                <w:iCs/>
-                <w:color w:val="000000"/>
-                <w:sz w:val="18"/>
-                <w:szCs w:val="20"/>
-                <w:lang w:val="en-US"/>
-              </w:rPr>
-              <w:t>{{ tahun</w:t>
-            </w:r>
-            <w:proofErr w:type="gramEnd"/>
-            <w:r>
-              <w:rPr>
-                <w:rFonts w:ascii="Tahoma" w:hAnsi="Tahoma" w:cs="Tahoma"/>
-                <w:b/>
-                <w:iCs/>
-                <w:color w:val="000000"/>
-                <w:sz w:val="18"/>
-                <w:szCs w:val="20"/>
-                <w:lang w:val="en-US"/>
-              </w:rPr>
-              <w:t>_</w:t>
-            </w:r>
-            <w:proofErr w:type="gramStart"/>
-            <w:r>
-              <w:rPr>
-                <w:rFonts w:ascii="Tahoma" w:hAnsi="Tahoma" w:cs="Tahoma"/>
-                <w:b/>
-                <w:iCs/>
-                <w:color w:val="000000"/>
-                <w:sz w:val="18"/>
-                <w:szCs w:val="20"/>
-                <w:lang w:val="en-US"/>
-              </w:rPr>
-              <w:t>tagihan }</w:t>
-            </w:r>
-            <w:proofErr w:type="gramEnd"/>
-            <w:r>
-              <w:rPr>
-                <w:rFonts w:ascii="Tahoma" w:hAnsi="Tahoma" w:cs="Tahoma"/>
-                <w:b/>
-                <w:iCs/>
-                <w:color w:val="000000"/>
-                <w:sz w:val="18"/>
-                <w:szCs w:val="20"/>
-                <w:lang w:val="en-US"/>
-              </w:rPr>
-              <w:t>}</w:t>
+              <w:t>{{ bulan_tagihan }} {{ tahun_tagihan }}</w:t>
             </w:r>
           </w:p>
           <w:p>
@@ -2046,7 +1646,6 @@
                 <w:lang w:val="en-US"/>
               </w:rPr>
             </w:pPr>
-            <w:proofErr w:type="gramStart"/>
             <w:r>
               <w:rPr>
                 <w:rFonts w:ascii="Tahoma" w:hAnsi="Tahoma" w:cs="Tahoma"/>
@@ -2055,40 +1654,7 @@
                 <w:szCs w:val="18"/>
                 <w:lang w:val="en-US"/>
               </w:rPr>
-              <w:t>{{ nama</w:t>
-            </w:r>
-            <w:proofErr w:type="gramEnd"/>
-            <w:r>
-              <w:rPr>
-                <w:rFonts w:ascii="Tahoma" w:hAnsi="Tahoma" w:cs="Tahoma"/>
-                <w:b/>
-                <w:sz w:val="18"/>
-                <w:szCs w:val="18"/>
-                <w:lang w:val="en-US"/>
-              </w:rPr>
-              <w:t>_</w:t>
-            </w:r>
-            <w:proofErr w:type="gramStart"/>
-            <w:r>
-              <w:rPr>
-                <w:rFonts w:ascii="Tahoma" w:hAnsi="Tahoma" w:cs="Tahoma"/>
-                <w:b/>
-                <w:sz w:val="18"/>
-                <w:szCs w:val="18"/>
-                <w:lang w:val="en-US"/>
-              </w:rPr>
-              <w:t>pejabat }</w:t>
-            </w:r>
-            <w:proofErr w:type="gramEnd"/>
-            <w:r>
-              <w:rPr>
-                <w:rFonts w:ascii="Tahoma" w:hAnsi="Tahoma" w:cs="Tahoma"/>
-                <w:b/>
-                <w:sz w:val="18"/>
-                <w:szCs w:val="18"/>
-                <w:lang w:val="en-US"/>
-              </w:rPr>
-              <w:t>}</w:t>
+              <w:t>{{ nama_pejabat }}</w:t>
             </w:r>
           </w:p>
           <w:p>
@@ -2108,7 +1674,6 @@
                 <w:lang w:val="en-US"/>
               </w:rPr>
             </w:pPr>
-            <w:proofErr w:type="gramStart"/>
             <w:r>
               <w:rPr>
                 <w:rFonts w:ascii="Tahoma" w:hAnsi="Tahoma" w:cs="Tahoma"/>
@@ -2116,37 +1681,7 @@
                 <w:szCs w:val="18"/>
                 <w:lang w:val="en-US"/>
               </w:rPr>
-              <w:t>{{ pangkat</w:t>
-            </w:r>
-            <w:proofErr w:type="gramEnd"/>
-            <w:r>
-              <w:rPr>
-                <w:rFonts w:ascii="Tahoma" w:hAnsi="Tahoma" w:cs="Tahoma"/>
-                <w:sz w:val="18"/>
-                <w:szCs w:val="18"/>
-                <w:lang w:val="en-US"/>
-              </w:rPr>
-              <w:t>_</w:t>
-            </w:r>
-            <w:proofErr w:type="gramStart"/>
-            <w:r>
-              <w:rPr>
-                <w:rFonts w:ascii="Tahoma" w:hAnsi="Tahoma" w:cs="Tahoma"/>
-                <w:sz w:val="18"/>
-                <w:szCs w:val="18"/>
-                <w:lang w:val="en-US"/>
-              </w:rPr>
-              <w:t>pejabat }</w:t>
-            </w:r>
-            <w:proofErr w:type="gramEnd"/>
-            <w:r>
-              <w:rPr>
-                <w:rFonts w:ascii="Tahoma" w:hAnsi="Tahoma" w:cs="Tahoma"/>
-                <w:sz w:val="18"/>
-                <w:szCs w:val="18"/>
-                <w:lang w:val="en-US"/>
-              </w:rPr>
-              <w:t>}</w:t>
+              <w:t>{{ pangkat_pejabat }}</w:t>
             </w:r>
           </w:p>
           <w:p>
@@ -2177,7 +1712,6 @@
               </w:rPr>
               <w:t xml:space="preserve">NIP. </w:t>
             </w:r>
-            <w:proofErr w:type="gramStart"/>
             <w:r>
               <w:rPr>
                 <w:rFonts w:ascii="Tahoma" w:hAnsi="Tahoma" w:cs="Tahoma"/>
@@ -2186,18 +1720,7 @@
                 <w:szCs w:val="18"/>
                 <w:lang w:val="en-US"/>
               </w:rPr>
-              <w:t>{{ nip</w:t>
-            </w:r>
-            <w:proofErr w:type="gramEnd"/>
-            <w:r>
-              <w:rPr>
-                <w:rFonts w:ascii="Tahoma" w:hAnsi="Tahoma" w:cs="Tahoma"/>
-                <w:color w:val="000000"/>
-                <w:sz w:val="18"/>
-                <w:szCs w:val="18"/>
-                <w:lang w:val="en-US"/>
-              </w:rPr>
-              <w:t>_pejabat }}</w:t>
+              <w:t>{{ nip_pejabat }}</w:t>
             </w:r>
           </w:p>
         </w:tc>
@@ -2267,7 +1790,7 @@
 </file>
 
 <file path=word/endnotes.xml><?xml version="1.0" encoding="utf-8"?>
-<w:endnotes xmlns:wpc="http://schemas.microsoft.com/office/word/2010/wordprocessingCanvas" xmlns:cx="http://schemas.microsoft.com/office/drawing/2014/chartex" xmlns:cx1="http://schemas.microsoft.com/office/drawing/2015/9/8/chartex" xmlns:cx2="http://schemas.microsoft.com/office/drawing/2015/10/21/chartex" xmlns:cx3="http://schemas.microsoft.com/office/drawing/2016/5/9/chartex" xmlns:cx4="http://schemas.microsoft.com/office/drawing/2016/5/10/chartex" xmlns:cx5="http://schemas.microsoft.com/office/drawing/2016/5/11/chartex" xmlns:cx6="http://schemas.microsoft.com/office/drawing/2016/5/12/chartex" xmlns:cx7="http://schemas.microsoft.com/office/drawing/2016/5/13/chartex" xmlns:cx8="http://schemas.microsoft.com/office/drawing/2016/5/14/chartex" xmlns:mc="http://schemas.openxmlformats.org/markup-compatibility/2006" xmlns:aink="http://schemas.microsoft.com/office/drawing/2016/ink" xmlns:am3d="http://schemas.microsoft.com/office/drawing/2017/model3d" xmlns:o="urn:schemas-microsoft-com:office:office" xmlns:oel="http://schemas.microsoft.com/office/2019/extlst" xmlns:r="http://schemas.openxmlformats.org/officeDocument/2006/relationships" xmlns:m="http://schemas.openxmlformats.org/officeDocument/2006/math" xmlns:v="urn:schemas-microsoft-com:vml" xmlns:wp14="http://schemas.microsoft.com/office/word/2010/wordprocessingDrawing" xmlns:wp="http://schemas.openxmlformats.org/drawingml/2006/wordprocessingDrawing" xmlns:w10="urn:schemas-microsoft-com:office:word" xmlns:w="http://schemas.openxmlformats.org/wordprocessingml/2006/main" xmlns:w14="http://schemas.microsoft.com/office/word/2010/wordml" xmlns:w15="http://schemas.microsoft.com/office/word/2012/wordml" xmlns:w16cex="http://schemas.microsoft.com/office/word/2018/wordml/cex" xmlns:w16cid="http://schemas.microsoft.com/office/word/2016/wordml/cid" xmlns:w16="http://schemas.microsoft.com/office/word/2018/wordml" xmlns:w16du="http://schemas.microsoft.com/office/word/2023/wordml/word16du" xmlns:w16sdtdh="http://schemas.microsoft.com/office/word/2020/wordml/sdtdatahash" xmlns:w16sdtfl="http://schemas.microsoft.com/office/word/2024/wordml/sdtformatlock" xmlns:w16se="http://schemas.microsoft.com/office/word/2015/wordml/symex" xmlns:wpg="http://schemas.microsoft.com/office/word/2010/wordprocessingGroup" xmlns:wpi="http://schemas.microsoft.com/office/word/2010/wordprocessingInk" xmlns:wne="http://schemas.microsoft.com/office/word/2006/wordml" xmlns:wps="http://schemas.microsoft.com/office/word/2010/wordprocessingShape" mc:Ignorable="w14 w15 w16se w16cid w16 w16cex w16sdtdh w16sdtfl w16du wp14">
+<w:endnotes xmlns:wpc="http://schemas.microsoft.com/office/word/2010/wordprocessingCanvas" xmlns:cx="http://schemas.microsoft.com/office/drawing/2014/chartex" xmlns:cx1="http://schemas.microsoft.com/office/drawing/2015/9/8/chartex" xmlns:cx2="http://schemas.microsoft.com/office/drawing/2015/10/21/chartex" xmlns:cx3="http://schemas.microsoft.com/office/drawing/2016/5/9/chartex" xmlns:cx4="http://schemas.microsoft.com/office/drawing/2016/5/10/chartex" xmlns:cx5="http://schemas.microsoft.com/office/drawing/2016/5/11/chartex" xmlns:cx6="http://schemas.microsoft.com/office/drawing/2016/5/12/chartex" xmlns:cx7="http://schemas.microsoft.com/office/drawing/2016/5/13/chartex" xmlns:cx8="http://schemas.microsoft.com/office/drawing/2016/5/14/chartex" xmlns:mc="http://schemas.openxmlformats.org/markup-compatibility/2006" xmlns:aink="http://schemas.microsoft.com/office/drawing/2016/ink" xmlns:am3d="http://schemas.microsoft.com/office/drawing/2017/model3d" xmlns:o="urn:schemas-microsoft-com:office:office" xmlns:r="http://schemas.openxmlformats.org/officeDocument/2006/relationships" xmlns:m="http://schemas.openxmlformats.org/officeDocument/2006/math" xmlns:v="urn:schemas-microsoft-com:vml" xmlns:wp14="http://schemas.microsoft.com/office/word/2010/wordprocessingDrawing" xmlns:wp="http://schemas.openxmlformats.org/drawingml/2006/wordprocessingDrawing" xmlns:w10="urn:schemas-microsoft-com:office:word" xmlns:w="http://schemas.openxmlformats.org/wordprocessingml/2006/main" xmlns:w14="http://schemas.microsoft.com/office/word/2010/wordml" xmlns:w15="http://schemas.microsoft.com/office/word/2012/wordml" xmlns:w16cex="http://schemas.microsoft.com/office/word/2018/wordml/cex" xmlns:w16cid="http://schemas.microsoft.com/office/word/2016/wordml/cid" xmlns:w16="http://schemas.microsoft.com/office/word/2018/wordml" xmlns:w16sdtdh="http://schemas.microsoft.com/office/word/2020/wordml/sdtdatahash" xmlns:w16se="http://schemas.microsoft.com/office/word/2015/wordml/symex" xmlns:wpg="http://schemas.microsoft.com/office/word/2010/wordprocessingGroup" xmlns:wpi="http://schemas.microsoft.com/office/word/2010/wordprocessingInk" xmlns:wne="http://schemas.microsoft.com/office/word/2006/wordml" xmlns:wps="http://schemas.microsoft.com/office/word/2010/wordprocessingShape" mc:Ignorable="w14 w15 w16se w16cid w16 w16cex w16sdtdh wp14">
   <w:endnote w:type="separator" w:id="-1">
     <w:p>
       <w:r>
@@ -2286,7 +1809,7 @@
 </file>
 
 <file path=word/footnotes.xml><?xml version="1.0" encoding="utf-8"?>
-<w:footnotes xmlns:wpc="http://schemas.microsoft.com/office/word/2010/wordprocessingCanvas" xmlns:cx="http://schemas.microsoft.com/office/drawing/2014/chartex" xmlns:cx1="http://schemas.microsoft.com/office/drawing/2015/9/8/chartex" xmlns:cx2="http://schemas.microsoft.com/office/drawing/2015/10/21/chartex" xmlns:cx3="http://schemas.microsoft.com/office/drawing/2016/5/9/chartex" xmlns:cx4="http://schemas.microsoft.com/office/drawing/2016/5/10/chartex" xmlns:cx5="http://schemas.microsoft.com/office/drawing/2016/5/11/chartex" xmlns:cx6="http://schemas.microsoft.com/office/drawing/2016/5/12/chartex" xmlns:cx7="http://schemas.microsoft.com/office/drawing/2016/5/13/chartex" xmlns:cx8="http://schemas.microsoft.com/office/drawing/2016/5/14/chartex" xmlns:mc="http://schemas.openxmlformats.org/markup-compatibility/2006" xmlns:aink="http://schemas.microsoft.com/office/drawing/2016/ink" xmlns:am3d="http://schemas.microsoft.com/office/drawing/2017/model3d" xmlns:o="urn:schemas-microsoft-com:office:office" xmlns:oel="http://schemas.microsoft.com/office/2019/extlst" xmlns:r="http://schemas.openxmlformats.org/officeDocument/2006/relationships" xmlns:m="http://schemas.openxmlformats.org/officeDocument/2006/math" xmlns:v="urn:schemas-microsoft-com:vml" xmlns:wp14="http://schemas.microsoft.com/office/word/2010/wordprocessingDrawing" xmlns:wp="http://schemas.openxmlformats.org/drawingml/2006/wordprocessingDrawing" xmlns:w10="urn:schemas-microsoft-com:office:word" xmlns:w="http://schemas.openxmlformats.org/wordprocessingml/2006/main" xmlns:w14="http://schemas.microsoft.com/office/word/2010/wordml" xmlns:w15="http://schemas.microsoft.com/office/word/2012/wordml" xmlns:w16cex="http://schemas.microsoft.com/office/word/2018/wordml/cex" xmlns:w16cid="http://schemas.microsoft.com/office/word/2016/wordml/cid" xmlns:w16="http://schemas.microsoft.com/office/word/2018/wordml" xmlns:w16du="http://schemas.microsoft.com/office/word/2023/wordml/word16du" xmlns:w16sdtdh="http://schemas.microsoft.com/office/word/2020/wordml/sdtdatahash" xmlns:w16sdtfl="http://schemas.microsoft.com/office/word/2024/wordml/sdtformatlock" xmlns:w16se="http://schemas.microsoft.com/office/word/2015/wordml/symex" xmlns:wpg="http://schemas.microsoft.com/office/word/2010/wordprocessingGroup" xmlns:wpi="http://schemas.microsoft.com/office/word/2010/wordprocessingInk" xmlns:wne="http://schemas.microsoft.com/office/word/2006/wordml" xmlns:wps="http://schemas.microsoft.com/office/word/2010/wordprocessingShape" mc:Ignorable="w14 w15 w16se w16cid w16 w16cex w16sdtdh w16sdtfl w16du wp14">
+<w:footnotes xmlns:wpc="http://schemas.microsoft.com/office/word/2010/wordprocessingCanvas" xmlns:cx="http://schemas.microsoft.com/office/drawing/2014/chartex" xmlns:cx1="http://schemas.microsoft.com/office/drawing/2015/9/8/chartex" xmlns:cx2="http://schemas.microsoft.com/office/drawing/2015/10/21/chartex" xmlns:cx3="http://schemas.microsoft.com/office/drawing/2016/5/9/chartex" xmlns:cx4="http://schemas.microsoft.com/office/drawing/2016/5/10/chartex" xmlns:cx5="http://schemas.microsoft.com/office/drawing/2016/5/11/chartex" xmlns:cx6="http://schemas.microsoft.com/office/drawing/2016/5/12/chartex" xmlns:cx7="http://schemas.microsoft.com/office/drawing/2016/5/13/chartex" xmlns:cx8="http://schemas.microsoft.com/office/drawing/2016/5/14/chartex" xmlns:mc="http://schemas.openxmlformats.org/markup-compatibility/2006" xmlns:aink="http://schemas.microsoft.com/office/drawing/2016/ink" xmlns:am3d="http://schemas.microsoft.com/office/drawing/2017/model3d" xmlns:o="urn:schemas-microsoft-com:office:office" xmlns:r="http://schemas.openxmlformats.org/officeDocument/2006/relationships" xmlns:m="http://schemas.openxmlformats.org/officeDocument/2006/math" xmlns:v="urn:schemas-microsoft-com:vml" xmlns:wp14="http://schemas.microsoft.com/office/word/2010/wordprocessingDrawing" xmlns:wp="http://schemas.openxmlformats.org/drawingml/2006/wordprocessingDrawing" xmlns:w10="urn:schemas-microsoft-com:office:word" xmlns:w="http://schemas.openxmlformats.org/wordprocessingml/2006/main" xmlns:w14="http://schemas.microsoft.com/office/word/2010/wordml" xmlns:w15="http://schemas.microsoft.com/office/word/2012/wordml" xmlns:w16cex="http://schemas.microsoft.com/office/word/2018/wordml/cex" xmlns:w16cid="http://schemas.microsoft.com/office/word/2016/wordml/cid" xmlns:w16="http://schemas.microsoft.com/office/word/2018/wordml" xmlns:w16sdtdh="http://schemas.microsoft.com/office/word/2020/wordml/sdtdatahash" xmlns:w16se="http://schemas.microsoft.com/office/word/2015/wordml/symex" xmlns:wpg="http://schemas.microsoft.com/office/word/2010/wordprocessingGroup" xmlns:wpi="http://schemas.microsoft.com/office/word/2010/wordprocessingInk" xmlns:wne="http://schemas.microsoft.com/office/word/2006/wordml" xmlns:wps="http://schemas.microsoft.com/office/word/2010/wordprocessingShape" mc:Ignorable="w14 w15 w16se w16cid w16 w16cex w16sdtdh wp14">
   <w:footnote w:type="separator" w:id="-1">
     <w:p>
       <w:r>
@@ -2305,7 +1828,7 @@
 </file>
 
 <file path=word/header1.xml><?xml version="1.0" encoding="utf-8"?>
-<w:hdr xmlns:wpc="http://schemas.microsoft.com/office/word/2010/wordprocessingCanvas" xmlns:cx="http://schemas.microsoft.com/office/drawing/2014/chartex" xmlns:cx1="http://schemas.microsoft.com/office/drawing/2015/9/8/chartex" xmlns:cx2="http://schemas.microsoft.com/office/drawing/2015/10/21/chartex" xmlns:cx3="http://schemas.microsoft.com/office/drawing/2016/5/9/chartex" xmlns:cx4="http://schemas.microsoft.com/office/drawing/2016/5/10/chartex" xmlns:cx5="http://schemas.microsoft.com/office/drawing/2016/5/11/chartex" xmlns:cx6="http://schemas.microsoft.com/office/drawing/2016/5/12/chartex" xmlns:cx7="http://schemas.microsoft.com/office/drawing/2016/5/13/chartex" xmlns:cx8="http://schemas.microsoft.com/office/drawing/2016/5/14/chartex" xmlns:mc="http://schemas.openxmlformats.org/markup-compatibility/2006" xmlns:aink="http://schemas.microsoft.com/office/drawing/2016/ink" xmlns:am3d="http://schemas.microsoft.com/office/drawing/2017/model3d" xmlns:o="urn:schemas-microsoft-com:office:office" xmlns:oel="http://schemas.microsoft.com/office/2019/extlst" xmlns:r="http://schemas.openxmlformats.org/officeDocument/2006/relationships" xmlns:m="http://schemas.openxmlformats.org/officeDocument/2006/math" xmlns:v="urn:schemas-microsoft-com:vml" xmlns:wp14="http://schemas.microsoft.com/office/word/2010/wordprocessingDrawing" xmlns:wp="http://schemas.openxmlformats.org/drawingml/2006/wordprocessingDrawing" xmlns:w10="urn:schemas-microsoft-com:office:word" xmlns:w="http://schemas.openxmlformats.org/wordprocessingml/2006/main" xmlns:w14="http://schemas.microsoft.com/office/word/2010/wordml" xmlns:w15="http://schemas.microsoft.com/office/word/2012/wordml" xmlns:w16cex="http://schemas.microsoft.com/office/word/2018/wordml/cex" xmlns:w16cid="http://schemas.microsoft.com/office/word/2016/wordml/cid" xmlns:w16="http://schemas.microsoft.com/office/word/2018/wordml" xmlns:w16du="http://schemas.microsoft.com/office/word/2023/wordml/word16du" xmlns:w16sdtdh="http://schemas.microsoft.com/office/word/2020/wordml/sdtdatahash" xmlns:w16sdtfl="http://schemas.microsoft.com/office/word/2024/wordml/sdtformatlock" xmlns:w16se="http://schemas.microsoft.com/office/word/2015/wordml/symex" xmlns:wpg="http://schemas.microsoft.com/office/word/2010/wordprocessingGroup" xmlns:wpi="http://schemas.microsoft.com/office/word/2010/wordprocessingInk" xmlns:wne="http://schemas.microsoft.com/office/word/2006/wordml" xmlns:wps="http://schemas.microsoft.com/office/word/2010/wordprocessingShape" mc:Ignorable="w14 w15 w16se w16cid w16 w16cex w16sdtdh w16sdtfl w16du wp14">
+<w:hdr xmlns:wpc="http://schemas.microsoft.com/office/word/2010/wordprocessingCanvas" xmlns:cx="http://schemas.microsoft.com/office/drawing/2014/chartex" xmlns:cx1="http://schemas.microsoft.com/office/drawing/2015/9/8/chartex" xmlns:cx2="http://schemas.microsoft.com/office/drawing/2015/10/21/chartex" xmlns:cx3="http://schemas.microsoft.com/office/drawing/2016/5/9/chartex" xmlns:cx4="http://schemas.microsoft.com/office/drawing/2016/5/10/chartex" xmlns:cx5="http://schemas.microsoft.com/office/drawing/2016/5/11/chartex" xmlns:cx6="http://schemas.microsoft.com/office/drawing/2016/5/12/chartex" xmlns:cx7="http://schemas.microsoft.com/office/drawing/2016/5/13/chartex" xmlns:cx8="http://schemas.microsoft.com/office/drawing/2016/5/14/chartex" xmlns:mc="http://schemas.openxmlformats.org/markup-compatibility/2006" xmlns:aink="http://schemas.microsoft.com/office/drawing/2016/ink" xmlns:am3d="http://schemas.microsoft.com/office/drawing/2017/model3d" xmlns:o="urn:schemas-microsoft-com:office:office" xmlns:r="http://schemas.openxmlformats.org/officeDocument/2006/relationships" xmlns:m="http://schemas.openxmlformats.org/officeDocument/2006/math" xmlns:v="urn:schemas-microsoft-com:vml" xmlns:wp14="http://schemas.microsoft.com/office/word/2010/wordprocessingDrawing" xmlns:wp="http://schemas.openxmlformats.org/drawingml/2006/wordprocessingDrawing" xmlns:w10="urn:schemas-microsoft-com:office:word" xmlns:w="http://schemas.openxmlformats.org/wordprocessingml/2006/main" xmlns:w14="http://schemas.microsoft.com/office/word/2010/wordml" xmlns:w15="http://schemas.microsoft.com/office/word/2012/wordml" xmlns:w16cex="http://schemas.microsoft.com/office/word/2018/wordml/cex" xmlns:w16cid="http://schemas.microsoft.com/office/word/2016/wordml/cid" xmlns:w16="http://schemas.microsoft.com/office/word/2018/wordml" xmlns:w16sdtdh="http://schemas.microsoft.com/office/word/2020/wordml/sdtdatahash" xmlns:w16se="http://schemas.microsoft.com/office/word/2015/wordml/symex" xmlns:wpg="http://schemas.microsoft.com/office/word/2010/wordprocessingGroup" xmlns:wpi="http://schemas.microsoft.com/office/word/2010/wordprocessingInk" xmlns:wne="http://schemas.microsoft.com/office/word/2006/wordml" xmlns:wps="http://schemas.microsoft.com/office/word/2010/wordprocessingShape" mc:Ignorable="w14 w15 w16se w16cid w16 w16cex w16sdtdh wp14">
   <w:p>
     <w:pPr>
       <w:pStyle w:val="Header"/>
@@ -2326,7 +1849,7 @@
 </file>
 
 <file path=word/numbering.xml><?xml version="1.0" encoding="utf-8"?>
-<w:numbering xmlns:wpc="http://schemas.microsoft.com/office/word/2010/wordprocessingCanvas" xmlns:cx="http://schemas.microsoft.com/office/drawing/2014/chartex" xmlns:cx1="http://schemas.microsoft.com/office/drawing/2015/9/8/chartex" xmlns:cx2="http://schemas.microsoft.com/office/drawing/2015/10/21/chartex" xmlns:cx3="http://schemas.microsoft.com/office/drawing/2016/5/9/chartex" xmlns:cx4="http://schemas.microsoft.com/office/drawing/2016/5/10/chartex" xmlns:cx5="http://schemas.microsoft.com/office/drawing/2016/5/11/chartex" xmlns:cx6="http://schemas.microsoft.com/office/drawing/2016/5/12/chartex" xmlns:cx7="http://schemas.microsoft.com/office/drawing/2016/5/13/chartex" xmlns:cx8="http://schemas.microsoft.com/office/drawing/2016/5/14/chartex" xmlns:mc="http://schemas.openxmlformats.org/markup-compatibility/2006" xmlns:aink="http://schemas.microsoft.com/office/drawing/2016/ink" xmlns:am3d="http://schemas.microsoft.com/office/drawing/2017/model3d" xmlns:o="urn:schemas-microsoft-com:office:office" xmlns:oel="http://schemas.microsoft.com/office/2019/extlst" xmlns:r="http://schemas.openxmlformats.org/officeDocument/2006/relationships" xmlns:m="http://schemas.openxmlformats.org/officeDocument/2006/math" xmlns:v="urn:schemas-microsoft-com:vml" xmlns:wp14="http://schemas.microsoft.com/office/word/2010/wordprocessingDrawing" xmlns:wp="http://schemas.openxmlformats.org/drawingml/2006/wordprocessingDrawing" xmlns:w10="urn:schemas-microsoft-com:office:word" xmlns:w="http://schemas.openxmlformats.org/wordprocessingml/2006/main" xmlns:w14="http://schemas.microsoft.com/office/word/2010/wordml" xmlns:w15="http://schemas.microsoft.com/office/word/2012/wordml" xmlns:w16cex="http://schemas.microsoft.com/office/word/2018/wordml/cex" xmlns:w16cid="http://schemas.microsoft.com/office/word/2016/wordml/cid" xmlns:w16="http://schemas.microsoft.com/office/word/2018/wordml" xmlns:w16du="http://schemas.microsoft.com/office/word/2023/wordml/word16du" xmlns:w16sdtdh="http://schemas.microsoft.com/office/word/2020/wordml/sdtdatahash" xmlns:w16sdtfl="http://schemas.microsoft.com/office/word/2024/wordml/sdtformatlock" xmlns:w16se="http://schemas.microsoft.com/office/word/2015/wordml/symex" xmlns:wpg="http://schemas.microsoft.com/office/word/2010/wordprocessingGroup" xmlns:wpi="http://schemas.microsoft.com/office/word/2010/wordprocessingInk" xmlns:wne="http://schemas.microsoft.com/office/word/2006/wordml" xmlns:wps="http://schemas.microsoft.com/office/word/2010/wordprocessingShape" mc:Ignorable="w14 w15 w16se w16cid w16 w16cex w16sdtdh w16sdtfl w16du wp14">
+<w:numbering xmlns:wpc="http://schemas.microsoft.com/office/word/2010/wordprocessingCanvas" xmlns:cx="http://schemas.microsoft.com/office/drawing/2014/chartex" xmlns:cx1="http://schemas.microsoft.com/office/drawing/2015/9/8/chartex" xmlns:cx2="http://schemas.microsoft.com/office/drawing/2015/10/21/chartex" xmlns:cx3="http://schemas.microsoft.com/office/drawing/2016/5/9/chartex" xmlns:cx4="http://schemas.microsoft.com/office/drawing/2016/5/10/chartex" xmlns:cx5="http://schemas.microsoft.com/office/drawing/2016/5/11/chartex" xmlns:cx6="http://schemas.microsoft.com/office/drawing/2016/5/12/chartex" xmlns:cx7="http://schemas.microsoft.com/office/drawing/2016/5/13/chartex" xmlns:cx8="http://schemas.microsoft.com/office/drawing/2016/5/14/chartex" xmlns:mc="http://schemas.openxmlformats.org/markup-compatibility/2006" xmlns:aink="http://schemas.microsoft.com/office/drawing/2016/ink" xmlns:am3d="http://schemas.microsoft.com/office/drawing/2017/model3d" xmlns:o="urn:schemas-microsoft-com:office:office" xmlns:r="http://schemas.openxmlformats.org/officeDocument/2006/relationships" xmlns:m="http://schemas.openxmlformats.org/officeDocument/2006/math" xmlns:v="urn:schemas-microsoft-com:vml" xmlns:wp14="http://schemas.microsoft.com/office/word/2010/wordprocessingDrawing" xmlns:wp="http://schemas.openxmlformats.org/drawingml/2006/wordprocessingDrawing" xmlns:w10="urn:schemas-microsoft-com:office:word" xmlns:w="http://schemas.openxmlformats.org/wordprocessingml/2006/main" xmlns:w14="http://schemas.microsoft.com/office/word/2010/wordml" xmlns:w15="http://schemas.microsoft.com/office/word/2012/wordml" xmlns:w16cex="http://schemas.microsoft.com/office/word/2018/wordml/cex" xmlns:w16cid="http://schemas.microsoft.com/office/word/2016/wordml/cid" xmlns:w16="http://schemas.microsoft.com/office/word/2018/wordml" xmlns:w16sdtdh="http://schemas.microsoft.com/office/word/2020/wordml/sdtdatahash" xmlns:w16se="http://schemas.microsoft.com/office/word/2015/wordml/symex" xmlns:wpg="http://schemas.microsoft.com/office/word/2010/wordprocessingGroup" xmlns:wpi="http://schemas.microsoft.com/office/word/2010/wordprocessingInk" xmlns:wne="http://schemas.microsoft.com/office/word/2006/wordml" xmlns:wps="http://schemas.microsoft.com/office/word/2010/wordprocessingShape" mc:Ignorable="w14 w15 w16se w16cid w16 w16cex w16sdtdh wp14">
   <w:abstractNum w:abstractNumId="0" w15:restartNumberingAfterBreak="0">
     <w:nsid w:val="01F25770"/>
     <w:multiLevelType w:val="hybridMultilevel"/>
@@ -3411,44 +2934,44 @@
       </w:pPr>
     </w:lvl>
   </w:abstractNum>
-  <w:num w:numId="1" w16cid:durableId="908033705">
+  <w:num w:numId="1">
     <w:abstractNumId w:val="6"/>
   </w:num>
-  <w:num w:numId="2" w16cid:durableId="1551263787">
+  <w:num w:numId="2">
     <w:abstractNumId w:val="9"/>
   </w:num>
-  <w:num w:numId="3" w16cid:durableId="162136351">
+  <w:num w:numId="3">
     <w:abstractNumId w:val="2"/>
   </w:num>
-  <w:num w:numId="4" w16cid:durableId="888611995">
+  <w:num w:numId="4">
     <w:abstractNumId w:val="5"/>
   </w:num>
-  <w:num w:numId="5" w16cid:durableId="2130782487">
+  <w:num w:numId="5">
     <w:abstractNumId w:val="7"/>
   </w:num>
-  <w:num w:numId="6" w16cid:durableId="557327983">
+  <w:num w:numId="6">
     <w:abstractNumId w:val="8"/>
   </w:num>
-  <w:num w:numId="7" w16cid:durableId="444153404">
+  <w:num w:numId="7">
     <w:abstractNumId w:val="4"/>
   </w:num>
-  <w:num w:numId="8" w16cid:durableId="971787777">
+  <w:num w:numId="8">
     <w:abstractNumId w:val="1"/>
   </w:num>
-  <w:num w:numId="9" w16cid:durableId="900991444">
+  <w:num w:numId="9">
     <w:abstractNumId w:val="3"/>
   </w:num>
-  <w:num w:numId="10" w16cid:durableId="710809273">
+  <w:num w:numId="10">
     <w:abstractNumId w:val="10"/>
   </w:num>
-  <w:num w:numId="11" w16cid:durableId="1919902800">
+  <w:num w:numId="11">
     <w:abstractNumId w:val="0"/>
   </w:num>
 </w:numbering>
 </file>
 
 <file path=word/styles.xml><?xml version="1.0" encoding="utf-8"?>
-<w:styles xmlns:mc="http://schemas.openxmlformats.org/markup-compatibility/2006" xmlns:r="http://schemas.openxmlformats.org/officeDocument/2006/relationships" xmlns:w="http://schemas.openxmlformats.org/wordprocessingml/2006/main" xmlns:w14="http://schemas.microsoft.com/office/word/2010/wordml" xmlns:w15="http://schemas.microsoft.com/office/word/2012/wordml" xmlns:w16cex="http://schemas.microsoft.com/office/word/2018/wordml/cex" xmlns:w16cid="http://schemas.microsoft.com/office/word/2016/wordml/cid" xmlns:w16="http://schemas.microsoft.com/office/word/2018/wordml" xmlns:w16du="http://schemas.microsoft.com/office/word/2023/wordml/word16du" xmlns:w16sdtdh="http://schemas.microsoft.com/office/word/2020/wordml/sdtdatahash" xmlns:w16sdtfl="http://schemas.microsoft.com/office/word/2024/wordml/sdtformatlock" xmlns:w16se="http://schemas.microsoft.com/office/word/2015/wordml/symex" mc:Ignorable="w14 w15 w16se w16cid w16 w16cex w16sdtdh w16sdtfl w16du">
+<w:styles xmlns:mc="http://schemas.openxmlformats.org/markup-compatibility/2006" xmlns:r="http://schemas.openxmlformats.org/officeDocument/2006/relationships" xmlns:w="http://schemas.openxmlformats.org/wordprocessingml/2006/main" xmlns:w14="http://schemas.microsoft.com/office/word/2010/wordml" xmlns:w15="http://schemas.microsoft.com/office/word/2012/wordml" xmlns:w16cex="http://schemas.microsoft.com/office/word/2018/wordml/cex" xmlns:w16cid="http://schemas.microsoft.com/office/word/2016/wordml/cid" xmlns:w16="http://schemas.microsoft.com/office/word/2018/wordml" xmlns:w16sdtdh="http://schemas.microsoft.com/office/word/2020/wordml/sdtdatahash" xmlns:w16se="http://schemas.microsoft.com/office/word/2015/wordml/symex" mc:Ignorable="w14 w15 w16se w16cid w16 w16cex w16sdtdh">
   <w:docDefaults>
     <w:rPrDefault>
       <w:rPr>

</xml_diff>

<commit_message>
feat: optimize tenant application flow and synchronize pricing
- Unified application logic into reusable ApplicationForm component
- Implemented explicit priority labels (Di Dalam/Luar Cimahi) for better UX
- Synchronized pricing and MBR criteria on location pages with DB/Perwal
- Fixed 500 error on applications table by adding missing columns
- Enable public access to room availability data (Floor Plan)
- Updated Google Maps embed links for all Rusunawa sites
- Fixed missing Lucide icon imports and optimized Image components
</commit_message>
<xml_diff>
--- a/rusun-backend/app/templates/template_skrd.docx
+++ b/rusun-backend/app/templates/template_skrd.docx
@@ -5,6 +5,7 @@
     <w:p>
       <w:pPr>
         <w:pStyle w:val="Title"/>
+        <w:jc w:val="left"/>
         <w:rPr>
           <w:rFonts w:ascii="Tahoma" w:hAnsi="Tahoma" w:cs="Tahoma"/>
           <w:bCs w:val="0"/>
@@ -23,9 +24,8 @@
           <w:sz w:val="26"/>
           <w:szCs w:val="26"/>
           <w:u w:val="single"/>
-          <w:lang w:val="en-US" w:eastAsia="en-US"/>
-        </w:rPr>
-        <w:object w:dxaOrig="1440" w:dyaOrig="1440" w14:anchorId="5A116964">
+        </w:rPr>
+        <w:object w:dxaOrig="1440" w:dyaOrig="1440" w14:anchorId="33FD1905">
           <v:shapetype id="_x0000_t75" coordsize="21600,21600" o:spt="75" o:preferrelative="t" path="m@4@5l@4@11@9@11@9@5xe" filled="f" stroked="f">
             <v:stroke joinstyle="miter"/>
             <v:formulas>
@@ -45,10 +45,10 @@
             <v:path o:extrusionok="f" gradientshapeok="t" o:connecttype="rect"/>
             <o:lock v:ext="edit" aspectratio="t"/>
           </v:shapetype>
-          <v:shape id="_x0000_s1057" type="#_x0000_t75" style="position:absolute;left:0;text-align:left;margin-left:44.5pt;margin-top:-51.8pt;width:63.55pt;height:66pt;z-index:251659264;visibility:visible;mso-wrap-style:tight;mso-wrap-edited:f">
+          <v:shape id="_x0000_s1059" type="#_x0000_t75" style="position:absolute;margin-left:47.25pt;margin-top:-53.65pt;width:64pt;height:70.45pt;z-index:251660288;visibility:visible;mso-wrap-style:tight;mso-wrap-edited:f">
             <v:imagedata r:id="rId8" o:title=""/>
           </v:shape>
-          <o:OLEObject Type="Embed" ProgID="Word.Picture.8" ShapeID="_x0000_s1057" DrawAspect="Content" ObjectID="_1837187317" r:id="rId9"/>
+          <o:OLEObject Type="Embed" ProgID="Word.Document.12" ShapeID="_x0000_s1059" DrawAspect="Content" ObjectID="_1837614596" r:id="rId9"/>
         </w:object>
       </w:r>
       <w:r>
@@ -60,13 +60,12 @@
           <w:sz w:val="26"/>
           <w:szCs w:val="26"/>
           <w:u w:val="single"/>
-          <w:lang w:val="en-US"/>
-        </w:rPr>
-        <w:object w:dxaOrig="1440" w:dyaOrig="1440" w14:anchorId="6904F911">
-          <v:shape id="_x0000_s1052" type="#_x0000_t75" style="position:absolute;left:0;text-align:left;margin-left:44.5pt;margin-top:-64.8pt;width:480.6pt;height:85.7pt;z-index:251655168" filled="t">
+        </w:rPr>
+        <w:object w:dxaOrig="1440" w:dyaOrig="1440" w14:anchorId="0FB59ABA">
+          <v:shape id="_x0000_s1058" type="#_x0000_t75" style="position:absolute;margin-left:47.85pt;margin-top:-66.05pt;width:493.95pt;height:88.65pt;z-index:251659264" filled="t">
             <v:imagedata r:id="rId10" o:title=""/>
           </v:shape>
-          <o:OLEObject Type="Embed" ProgID="Word.Document.12" ShapeID="_x0000_s1052" DrawAspect="Content" ObjectID="_1837187318" r:id="rId11"/>
+          <o:OLEObject Type="Embed" ProgID="Word.Document.12" ShapeID="_x0000_s1058" DrawAspect="Content" ObjectID="_1837614597" r:id="rId11"/>
         </w:object>
       </w:r>
       <w:r>
@@ -77,44 +76,8 @@
           <w:sz w:val="26"/>
           <w:szCs w:val="26"/>
           <w:u w:val="single"/>
-          <w:lang w:val="en-US"/>
-        </w:rPr>
-        <w:t>187</w:t>
-      </w:r>
-      <w:r>
-        <w:rPr>
-          <w:rFonts w:ascii="Tahoma" w:hAnsi="Tahoma" w:cs="Tahoma"/>
-          <w:bCs w:val="0"/>
-          <w:color w:val="000000"/>
-          <w:sz w:val="26"/>
-          <w:szCs w:val="26"/>
-          <w:u w:val="single"/>
-          <w:lang w:val="en-US"/>
-        </w:rPr>
-        <w:t>ppp</w:t>
-      </w:r>
-      <w:r>
-        <w:rPr>
-          <w:rFonts w:ascii="Tahoma" w:hAnsi="Tahoma" w:cs="Tahoma"/>
-          <w:bCs w:val="0"/>
-          <w:color w:val="000000"/>
-          <w:sz w:val="26"/>
-          <w:szCs w:val="26"/>
-          <w:u w:val="single"/>
-          <w:lang w:val="id-ID"/>
-        </w:rPr>
-        <w:t>p</w:t>
-      </w:r>
-      <w:r>
-        <w:rPr>
-          <w:rFonts w:ascii="Tahoma" w:hAnsi="Tahoma" w:cs="Tahoma"/>
-          <w:bCs w:val="0"/>
-          <w:color w:val="000000"/>
-          <w:sz w:val="26"/>
-          <w:szCs w:val="26"/>
-          <w:u w:val="single"/>
-        </w:rPr>
-        <w:t xml:space="preserve">  </w:t>
+        </w:rPr>
+        <w:t xml:space="preserve"> </w:t>
       </w:r>
     </w:p>
     <w:p>
@@ -155,6 +118,8 @@
           <w:szCs w:val="22"/>
         </w:rPr>
       </w:pPr>
+      <w:proofErr w:type="spellStart"/>
+      <w:proofErr w:type="gramStart"/>
       <w:r>
         <w:rPr>
           <w:rFonts w:ascii="Tahoma" w:hAnsi="Tahoma" w:cs="Tahoma"/>
@@ -164,7 +129,31 @@
           <w:sz w:val="22"/>
           <w:szCs w:val="22"/>
         </w:rPr>
-        <w:t xml:space="preserve">Nomor : </w:t>
+        <w:t>Nomor</w:t>
+      </w:r>
+      <w:proofErr w:type="spellEnd"/>
+      <w:r>
+        <w:rPr>
+          <w:rFonts w:ascii="Tahoma" w:hAnsi="Tahoma" w:cs="Tahoma"/>
+          <w:b w:val="0"/>
+          <w:bCs w:val="0"/>
+          <w:color w:val="000000"/>
+          <w:sz w:val="22"/>
+          <w:szCs w:val="22"/>
+        </w:rPr>
+        <w:t xml:space="preserve"> :</w:t>
+      </w:r>
+      <w:proofErr w:type="gramEnd"/>
+      <w:r>
+        <w:rPr>
+          <w:rFonts w:ascii="Tahoma" w:hAnsi="Tahoma" w:cs="Tahoma"/>
+          <w:b w:val="0"/>
+          <w:bCs w:val="0"/>
+          <w:color w:val="000000"/>
+          <w:sz w:val="22"/>
+          <w:szCs w:val="22"/>
+        </w:rPr>
+        <w:t xml:space="preserve"> </w:t>
       </w:r>
       <w:r>
         <w:rPr>
@@ -197,7 +186,27 @@
           <w:sz w:val="18"/>
           <w:szCs w:val="20"/>
         </w:rPr>
-        <w:t xml:space="preserve">Id Penghuni </w:t>
+        <w:t xml:space="preserve">Id </w:t>
+      </w:r>
+      <w:proofErr w:type="spellStart"/>
+      <w:r>
+        <w:rPr>
+          <w:rFonts w:ascii="Tahoma" w:hAnsi="Tahoma" w:cs="Tahoma"/>
+          <w:color w:val="000000"/>
+          <w:sz w:val="18"/>
+          <w:szCs w:val="20"/>
+        </w:rPr>
+        <w:t>Penghuni</w:t>
+      </w:r>
+      <w:proofErr w:type="spellEnd"/>
+      <w:r>
+        <w:rPr>
+          <w:rFonts w:ascii="Tahoma" w:hAnsi="Tahoma" w:cs="Tahoma"/>
+          <w:color w:val="000000"/>
+          <w:sz w:val="18"/>
+          <w:szCs w:val="20"/>
+        </w:rPr>
+        <w:t xml:space="preserve"> </w:t>
       </w:r>
       <w:r>
         <w:rPr>
@@ -218,14 +227,45 @@
         <w:tab/>
         <w:t xml:space="preserve">: </w:t>
       </w:r>
-      <w:r>
-        <w:rPr>
-          <w:rFonts w:ascii="Tahoma" w:hAnsi="Tahoma" w:cs="Tahoma"/>
-          <w:color w:val="000000"/>
-          <w:sz w:val="18"/>
-          <w:szCs w:val="20"/>
-        </w:rPr>
-        <w:t>{{ id_penghuni }}</w:t>
+      <w:proofErr w:type="gramStart"/>
+      <w:r>
+        <w:rPr>
+          <w:rFonts w:ascii="Tahoma" w:hAnsi="Tahoma" w:cs="Tahoma"/>
+          <w:color w:val="000000"/>
+          <w:sz w:val="18"/>
+          <w:szCs w:val="20"/>
+        </w:rPr>
+        <w:t xml:space="preserve">{{ </w:t>
+      </w:r>
+      <w:proofErr w:type="spellStart"/>
+      <w:r>
+        <w:rPr>
+          <w:rFonts w:ascii="Tahoma" w:hAnsi="Tahoma" w:cs="Tahoma"/>
+          <w:color w:val="000000"/>
+          <w:sz w:val="18"/>
+          <w:szCs w:val="20"/>
+        </w:rPr>
+        <w:t>id</w:t>
+      </w:r>
+      <w:proofErr w:type="gramEnd"/>
+      <w:r>
+        <w:rPr>
+          <w:rFonts w:ascii="Tahoma" w:hAnsi="Tahoma" w:cs="Tahoma"/>
+          <w:color w:val="000000"/>
+          <w:sz w:val="18"/>
+          <w:szCs w:val="20"/>
+        </w:rPr>
+        <w:t>_penghuni</w:t>
+      </w:r>
+      <w:proofErr w:type="spellEnd"/>
+      <w:r>
+        <w:rPr>
+          <w:rFonts w:ascii="Tahoma" w:hAnsi="Tahoma" w:cs="Tahoma"/>
+          <w:color w:val="000000"/>
+          <w:sz w:val="18"/>
+          <w:szCs w:val="20"/>
+        </w:rPr>
+        <w:t xml:space="preserve"> }}</w:t>
       </w:r>
     </w:p>
     <w:p>
@@ -285,14 +325,36 @@
         </w:rPr>
         <w:t xml:space="preserve"> </w:t>
       </w:r>
-      <w:r>
-        <w:rPr>
-          <w:rFonts w:ascii="Tahoma" w:hAnsi="Tahoma" w:cs="Tahoma"/>
-          <w:color w:val="000000"/>
-          <w:sz w:val="18"/>
-          <w:szCs w:val="20"/>
-        </w:rPr>
-        <w:t>{{ nama }}</w:t>
+      <w:proofErr w:type="gramStart"/>
+      <w:r>
+        <w:rPr>
+          <w:rFonts w:ascii="Tahoma" w:hAnsi="Tahoma" w:cs="Tahoma"/>
+          <w:color w:val="000000"/>
+          <w:sz w:val="18"/>
+          <w:szCs w:val="20"/>
+        </w:rPr>
+        <w:t xml:space="preserve">{{ </w:t>
+      </w:r>
+      <w:proofErr w:type="spellStart"/>
+      <w:r>
+        <w:rPr>
+          <w:rFonts w:ascii="Tahoma" w:hAnsi="Tahoma" w:cs="Tahoma"/>
+          <w:color w:val="000000"/>
+          <w:sz w:val="18"/>
+          <w:szCs w:val="20"/>
+        </w:rPr>
+        <w:t>nama</w:t>
+      </w:r>
+      <w:proofErr w:type="spellEnd"/>
+      <w:proofErr w:type="gramEnd"/>
+      <w:r>
+        <w:rPr>
+          <w:rFonts w:ascii="Tahoma" w:hAnsi="Tahoma" w:cs="Tahoma"/>
+          <w:color w:val="000000"/>
+          <w:sz w:val="18"/>
+          <w:szCs w:val="20"/>
+        </w:rPr>
+        <w:t xml:space="preserve"> }}</w:t>
       </w:r>
     </w:p>
     <w:p>
@@ -312,7 +374,27 @@
           <w:sz w:val="18"/>
           <w:szCs w:val="20"/>
         </w:rPr>
-        <w:t xml:space="preserve">Alamat Hunian </w:t>
+        <w:t xml:space="preserve">Alamat </w:t>
+      </w:r>
+      <w:proofErr w:type="spellStart"/>
+      <w:r>
+        <w:rPr>
+          <w:rFonts w:ascii="Tahoma" w:hAnsi="Tahoma" w:cs="Tahoma"/>
+          <w:color w:val="000000"/>
+          <w:sz w:val="18"/>
+          <w:szCs w:val="20"/>
+        </w:rPr>
+        <w:t>Hunian</w:t>
+      </w:r>
+      <w:proofErr w:type="spellEnd"/>
+      <w:r>
+        <w:rPr>
+          <w:rFonts w:ascii="Tahoma" w:hAnsi="Tahoma" w:cs="Tahoma"/>
+          <w:color w:val="000000"/>
+          <w:sz w:val="18"/>
+          <w:szCs w:val="20"/>
+        </w:rPr>
+        <w:t xml:space="preserve"> </w:t>
       </w:r>
       <w:r>
         <w:rPr>
@@ -342,14 +424,45 @@
         </w:rPr>
         <w:t xml:space="preserve"> </w:t>
       </w:r>
-      <w:r>
-        <w:rPr>
-          <w:rFonts w:ascii="Tahoma" w:hAnsi="Tahoma" w:cs="Tahoma"/>
-          <w:color w:val="000000"/>
-          <w:sz w:val="18"/>
-          <w:szCs w:val="20"/>
-        </w:rPr>
-        <w:t>{{ alamat_hunian }}</w:t>
+      <w:proofErr w:type="gramStart"/>
+      <w:r>
+        <w:rPr>
+          <w:rFonts w:ascii="Tahoma" w:hAnsi="Tahoma" w:cs="Tahoma"/>
+          <w:color w:val="000000"/>
+          <w:sz w:val="18"/>
+          <w:szCs w:val="20"/>
+        </w:rPr>
+        <w:t xml:space="preserve">{{ </w:t>
+      </w:r>
+      <w:proofErr w:type="spellStart"/>
+      <w:r>
+        <w:rPr>
+          <w:rFonts w:ascii="Tahoma" w:hAnsi="Tahoma" w:cs="Tahoma"/>
+          <w:color w:val="000000"/>
+          <w:sz w:val="18"/>
+          <w:szCs w:val="20"/>
+        </w:rPr>
+        <w:t>alamat</w:t>
+      </w:r>
+      <w:proofErr w:type="gramEnd"/>
+      <w:r>
+        <w:rPr>
+          <w:rFonts w:ascii="Tahoma" w:hAnsi="Tahoma" w:cs="Tahoma"/>
+          <w:color w:val="000000"/>
+          <w:sz w:val="18"/>
+          <w:szCs w:val="20"/>
+        </w:rPr>
+        <w:t>_hunian</w:t>
+      </w:r>
+      <w:proofErr w:type="spellEnd"/>
+      <w:r>
+        <w:rPr>
+          <w:rFonts w:ascii="Tahoma" w:hAnsi="Tahoma" w:cs="Tahoma"/>
+          <w:color w:val="000000"/>
+          <w:sz w:val="18"/>
+          <w:szCs w:val="20"/>
+        </w:rPr>
+        <w:t xml:space="preserve"> }}</w:t>
       </w:r>
     </w:p>
     <w:p>
@@ -369,7 +482,27 @@
           <w:sz w:val="18"/>
           <w:szCs w:val="20"/>
         </w:rPr>
-        <w:t xml:space="preserve">Unit Rusunawa </w:t>
+        <w:t xml:space="preserve">Unit </w:t>
+      </w:r>
+      <w:proofErr w:type="spellStart"/>
+      <w:r>
+        <w:rPr>
+          <w:rFonts w:ascii="Tahoma" w:hAnsi="Tahoma" w:cs="Tahoma"/>
+          <w:color w:val="000000"/>
+          <w:sz w:val="18"/>
+          <w:szCs w:val="20"/>
+        </w:rPr>
+        <w:t>Rusunawa</w:t>
+      </w:r>
+      <w:proofErr w:type="spellEnd"/>
+      <w:r>
+        <w:rPr>
+          <w:rFonts w:ascii="Tahoma" w:hAnsi="Tahoma" w:cs="Tahoma"/>
+          <w:color w:val="000000"/>
+          <w:sz w:val="18"/>
+          <w:szCs w:val="20"/>
+        </w:rPr>
+        <w:t xml:space="preserve"> </w:t>
       </w:r>
       <w:r>
         <w:rPr>
@@ -399,14 +532,36 @@
         </w:rPr>
         <w:t xml:space="preserve"> </w:t>
       </w:r>
-      <w:r>
-        <w:rPr>
-          <w:rFonts w:ascii="Tahoma" w:hAnsi="Tahoma" w:cs="Tahoma"/>
-          <w:color w:val="000000"/>
-          <w:sz w:val="18"/>
-          <w:szCs w:val="20"/>
-        </w:rPr>
-        <w:t>{{ rusunawa }}</w:t>
+      <w:proofErr w:type="gramStart"/>
+      <w:r>
+        <w:rPr>
+          <w:rFonts w:ascii="Tahoma" w:hAnsi="Tahoma" w:cs="Tahoma"/>
+          <w:color w:val="000000"/>
+          <w:sz w:val="18"/>
+          <w:szCs w:val="20"/>
+        </w:rPr>
+        <w:t xml:space="preserve">{{ </w:t>
+      </w:r>
+      <w:proofErr w:type="spellStart"/>
+      <w:r>
+        <w:rPr>
+          <w:rFonts w:ascii="Tahoma" w:hAnsi="Tahoma" w:cs="Tahoma"/>
+          <w:color w:val="000000"/>
+          <w:sz w:val="18"/>
+          <w:szCs w:val="20"/>
+        </w:rPr>
+        <w:t>rusunawa</w:t>
+      </w:r>
+      <w:proofErr w:type="spellEnd"/>
+      <w:proofErr w:type="gramEnd"/>
+      <w:r>
+        <w:rPr>
+          <w:rFonts w:ascii="Tahoma" w:hAnsi="Tahoma" w:cs="Tahoma"/>
+          <w:color w:val="000000"/>
+          <w:sz w:val="18"/>
+          <w:szCs w:val="20"/>
+        </w:rPr>
+        <w:t xml:space="preserve"> }}</w:t>
       </w:r>
       <w:r>
         <w:rPr>
@@ -436,7 +591,27 @@
           <w:sz w:val="18"/>
           <w:szCs w:val="20"/>
         </w:rPr>
-        <w:t xml:space="preserve">No Rekening / An </w:t>
+        <w:t xml:space="preserve">No </w:t>
+      </w:r>
+      <w:proofErr w:type="spellStart"/>
+      <w:r>
+        <w:rPr>
+          <w:rFonts w:ascii="Tahoma" w:hAnsi="Tahoma" w:cs="Tahoma"/>
+          <w:color w:val="000000"/>
+          <w:sz w:val="18"/>
+          <w:szCs w:val="20"/>
+        </w:rPr>
+        <w:t>Rekening</w:t>
+      </w:r>
+      <w:proofErr w:type="spellEnd"/>
+      <w:r>
+        <w:rPr>
+          <w:rFonts w:ascii="Tahoma" w:hAnsi="Tahoma" w:cs="Tahoma"/>
+          <w:color w:val="000000"/>
+          <w:sz w:val="18"/>
+          <w:szCs w:val="20"/>
+        </w:rPr>
+        <w:t xml:space="preserve"> / An </w:t>
       </w:r>
       <w:r>
         <w:rPr>
@@ -474,7 +649,87 @@
           <w:sz w:val="18"/>
           <w:szCs w:val="20"/>
         </w:rPr>
-        <w:t xml:space="preserve">/ Bendahara Penerimaan Disperkim Kota Cimahi  </w:t>
+        <w:t xml:space="preserve">/ </w:t>
+      </w:r>
+      <w:proofErr w:type="spellStart"/>
+      <w:r>
+        <w:rPr>
+          <w:rFonts w:ascii="Tahoma" w:hAnsi="Tahoma" w:cs="Tahoma"/>
+          <w:color w:val="000000"/>
+          <w:sz w:val="18"/>
+          <w:szCs w:val="20"/>
+        </w:rPr>
+        <w:t>Bendahara</w:t>
+      </w:r>
+      <w:proofErr w:type="spellEnd"/>
+      <w:r>
+        <w:rPr>
+          <w:rFonts w:ascii="Tahoma" w:hAnsi="Tahoma" w:cs="Tahoma"/>
+          <w:color w:val="000000"/>
+          <w:sz w:val="18"/>
+          <w:szCs w:val="20"/>
+        </w:rPr>
+        <w:t xml:space="preserve"> </w:t>
+      </w:r>
+      <w:proofErr w:type="spellStart"/>
+      <w:r>
+        <w:rPr>
+          <w:rFonts w:ascii="Tahoma" w:hAnsi="Tahoma" w:cs="Tahoma"/>
+          <w:color w:val="000000"/>
+          <w:sz w:val="18"/>
+          <w:szCs w:val="20"/>
+        </w:rPr>
+        <w:t>Penerimaan</w:t>
+      </w:r>
+      <w:proofErr w:type="spellEnd"/>
+      <w:r>
+        <w:rPr>
+          <w:rFonts w:ascii="Tahoma" w:hAnsi="Tahoma" w:cs="Tahoma"/>
+          <w:color w:val="000000"/>
+          <w:sz w:val="18"/>
+          <w:szCs w:val="20"/>
+        </w:rPr>
+        <w:t xml:space="preserve"> </w:t>
+      </w:r>
+      <w:proofErr w:type="spellStart"/>
+      <w:r>
+        <w:rPr>
+          <w:rFonts w:ascii="Tahoma" w:hAnsi="Tahoma" w:cs="Tahoma"/>
+          <w:color w:val="000000"/>
+          <w:sz w:val="18"/>
+          <w:szCs w:val="20"/>
+        </w:rPr>
+        <w:t>Disperkim</w:t>
+      </w:r>
+      <w:proofErr w:type="spellEnd"/>
+      <w:r>
+        <w:rPr>
+          <w:rFonts w:ascii="Tahoma" w:hAnsi="Tahoma" w:cs="Tahoma"/>
+          <w:color w:val="000000"/>
+          <w:sz w:val="18"/>
+          <w:szCs w:val="20"/>
+        </w:rPr>
+        <w:t xml:space="preserve"> Kota </w:t>
+      </w:r>
+      <w:proofErr w:type="spellStart"/>
+      <w:r>
+        <w:rPr>
+          <w:rFonts w:ascii="Tahoma" w:hAnsi="Tahoma" w:cs="Tahoma"/>
+          <w:color w:val="000000"/>
+          <w:sz w:val="18"/>
+          <w:szCs w:val="20"/>
+        </w:rPr>
+        <w:t>Cimahi</w:t>
+      </w:r>
+      <w:proofErr w:type="spellEnd"/>
+      <w:r>
+        <w:rPr>
+          <w:rFonts w:ascii="Tahoma" w:hAnsi="Tahoma" w:cs="Tahoma"/>
+          <w:color w:val="000000"/>
+          <w:sz w:val="18"/>
+          <w:szCs w:val="20"/>
+        </w:rPr>
+        <w:t xml:space="preserve">  </w:t>
       </w:r>
     </w:p>
     <w:p>
@@ -487,6 +742,7 @@
           <w:szCs w:val="20"/>
         </w:rPr>
       </w:pPr>
+      <w:proofErr w:type="spellStart"/>
       <w:r>
         <w:rPr>
           <w:rFonts w:ascii="Tahoma" w:hAnsi="Tahoma" w:cs="Tahoma"/>
@@ -494,8 +750,80 @@
           <w:sz w:val="20"/>
           <w:szCs w:val="20"/>
         </w:rPr>
-        <w:t>Dengan rincian sebagai berikut :</w:t>
-      </w:r>
+        <w:t>Dengan</w:t>
+      </w:r>
+      <w:proofErr w:type="spellEnd"/>
+      <w:r>
+        <w:rPr>
+          <w:rFonts w:ascii="Tahoma" w:hAnsi="Tahoma" w:cs="Tahoma"/>
+          <w:color w:val="000000"/>
+          <w:sz w:val="20"/>
+          <w:szCs w:val="20"/>
+        </w:rPr>
+        <w:t xml:space="preserve"> </w:t>
+      </w:r>
+      <w:proofErr w:type="spellStart"/>
+      <w:r>
+        <w:rPr>
+          <w:rFonts w:ascii="Tahoma" w:hAnsi="Tahoma" w:cs="Tahoma"/>
+          <w:color w:val="000000"/>
+          <w:sz w:val="20"/>
+          <w:szCs w:val="20"/>
+        </w:rPr>
+        <w:t>rincian</w:t>
+      </w:r>
+      <w:proofErr w:type="spellEnd"/>
+      <w:r>
+        <w:rPr>
+          <w:rFonts w:ascii="Tahoma" w:hAnsi="Tahoma" w:cs="Tahoma"/>
+          <w:color w:val="000000"/>
+          <w:sz w:val="20"/>
+          <w:szCs w:val="20"/>
+        </w:rPr>
+        <w:t xml:space="preserve"> </w:t>
+      </w:r>
+      <w:proofErr w:type="spellStart"/>
+      <w:r>
+        <w:rPr>
+          <w:rFonts w:ascii="Tahoma" w:hAnsi="Tahoma" w:cs="Tahoma"/>
+          <w:color w:val="000000"/>
+          <w:sz w:val="20"/>
+          <w:szCs w:val="20"/>
+        </w:rPr>
+        <w:t>sebagai</w:t>
+      </w:r>
+      <w:proofErr w:type="spellEnd"/>
+      <w:r>
+        <w:rPr>
+          <w:rFonts w:ascii="Tahoma" w:hAnsi="Tahoma" w:cs="Tahoma"/>
+          <w:color w:val="000000"/>
+          <w:sz w:val="20"/>
+          <w:szCs w:val="20"/>
+        </w:rPr>
+        <w:t xml:space="preserve"> </w:t>
+      </w:r>
+      <w:proofErr w:type="spellStart"/>
+      <w:proofErr w:type="gramStart"/>
+      <w:r>
+        <w:rPr>
+          <w:rFonts w:ascii="Tahoma" w:hAnsi="Tahoma" w:cs="Tahoma"/>
+          <w:color w:val="000000"/>
+          <w:sz w:val="20"/>
+          <w:szCs w:val="20"/>
+        </w:rPr>
+        <w:t>berikut</w:t>
+      </w:r>
+      <w:proofErr w:type="spellEnd"/>
+      <w:r>
+        <w:rPr>
+          <w:rFonts w:ascii="Tahoma" w:hAnsi="Tahoma" w:cs="Tahoma"/>
+          <w:color w:val="000000"/>
+          <w:sz w:val="20"/>
+          <w:szCs w:val="20"/>
+        </w:rPr>
+        <w:t xml:space="preserve"> :</w:t>
+      </w:r>
+      <w:proofErr w:type="gramEnd"/>
     </w:p>
     <w:tbl>
       <w:tblPr>
@@ -641,6 +969,7 @@
                 <w:lang w:val="en-US"/>
               </w:rPr>
             </w:pPr>
+            <w:proofErr w:type="spellStart"/>
             <w:r>
               <w:rPr>
                 <w:rFonts w:ascii="Tahoma" w:hAnsi="Tahoma" w:cs="Tahoma"/>
@@ -649,8 +978,9 @@
                 <w:sz w:val="18"/>
                 <w:szCs w:val="20"/>
               </w:rPr>
-              <w:t xml:space="preserve">Sewa </w:t>
-            </w:r>
+              <w:t>Sewa</w:t>
+            </w:r>
+            <w:proofErr w:type="spellEnd"/>
             <w:r>
               <w:rPr>
                 <w:rFonts w:ascii="Tahoma" w:hAnsi="Tahoma" w:cs="Tahoma"/>
@@ -658,6 +988,16 @@
                 <w:color w:val="000000"/>
                 <w:sz w:val="18"/>
                 <w:szCs w:val="20"/>
+              </w:rPr>
+              <w:t xml:space="preserve"> </w:t>
+            </w:r>
+            <w:r>
+              <w:rPr>
+                <w:rFonts w:ascii="Tahoma" w:hAnsi="Tahoma" w:cs="Tahoma"/>
+                <w:iCs/>
+                <w:color w:val="000000"/>
+                <w:sz w:val="18"/>
+                <w:szCs w:val="20"/>
                 <w:lang w:val="id-ID"/>
               </w:rPr>
               <w:t>Hunian</w:t>
@@ -673,6 +1013,7 @@
               </w:rPr>
               <w:t xml:space="preserve"> </w:t>
             </w:r>
+            <w:proofErr w:type="spellStart"/>
             <w:r>
               <w:rPr>
                 <w:rFonts w:ascii="Tahoma" w:hAnsi="Tahoma" w:cs="Tahoma"/>
@@ -683,8 +1024,9 @@
                 <w:szCs w:val="20"/>
                 <w:lang w:val="en-US"/>
               </w:rPr>
-              <w:t xml:space="preserve">Bulan </w:t>
-            </w:r>
+              <w:t>Bulan</w:t>
+            </w:r>
+            <w:proofErr w:type="spellEnd"/>
             <w:r>
               <w:rPr>
                 <w:rFonts w:ascii="Tahoma" w:hAnsi="Tahoma" w:cs="Tahoma"/>
@@ -695,8 +1037,9 @@
                 <w:szCs w:val="20"/>
                 <w:lang w:val="en-US"/>
               </w:rPr>
-              <w:t>{{ bulan_tagihan }}</w:t>
-            </w:r>
+              <w:t xml:space="preserve"> </w:t>
+            </w:r>
+            <w:proofErr w:type="gramStart"/>
             <w:r>
               <w:rPr>
                 <w:rFonts w:ascii="Tahoma" w:hAnsi="Tahoma" w:cs="Tahoma"/>
@@ -707,8 +1050,9 @@
                 <w:szCs w:val="20"/>
                 <w:lang w:val="en-US"/>
               </w:rPr>
-              <w:t xml:space="preserve"> </w:t>
-            </w:r>
+              <w:t xml:space="preserve">{{ </w:t>
+            </w:r>
+            <w:proofErr w:type="spellStart"/>
             <w:r>
               <w:rPr>
                 <w:rFonts w:ascii="Tahoma" w:hAnsi="Tahoma" w:cs="Tahoma"/>
@@ -719,7 +1063,83 @@
                 <w:szCs w:val="20"/>
                 <w:lang w:val="en-US"/>
               </w:rPr>
-              <w:t>{{ tahun_tagihan }}</w:t>
+              <w:t>bulan</w:t>
+            </w:r>
+            <w:proofErr w:type="gramEnd"/>
+            <w:r>
+              <w:rPr>
+                <w:rFonts w:ascii="Tahoma" w:hAnsi="Tahoma" w:cs="Tahoma"/>
+                <w:b/>
+                <w:iCs/>
+                <w:color w:val="000000"/>
+                <w:sz w:val="18"/>
+                <w:szCs w:val="20"/>
+                <w:lang w:val="en-US"/>
+              </w:rPr>
+              <w:t>_tagihan</w:t>
+            </w:r>
+            <w:proofErr w:type="spellEnd"/>
+            <w:r>
+              <w:rPr>
+                <w:rFonts w:ascii="Tahoma" w:hAnsi="Tahoma" w:cs="Tahoma"/>
+                <w:b/>
+                <w:iCs/>
+                <w:color w:val="000000"/>
+                <w:sz w:val="18"/>
+                <w:szCs w:val="20"/>
+                <w:lang w:val="en-US"/>
+              </w:rPr>
+              <w:t xml:space="preserve"> }}</w:t>
+            </w:r>
+            <w:r>
+              <w:rPr>
+                <w:rFonts w:ascii="Tahoma" w:hAnsi="Tahoma" w:cs="Tahoma"/>
+                <w:b/>
+                <w:iCs/>
+                <w:color w:val="000000"/>
+                <w:sz w:val="18"/>
+                <w:szCs w:val="20"/>
+                <w:lang w:val="en-US"/>
+              </w:rPr>
+              <w:t xml:space="preserve"> </w:t>
+            </w:r>
+            <w:r>
+              <w:rPr>
+                <w:rFonts w:ascii="Tahoma" w:hAnsi="Tahoma" w:cs="Tahoma"/>
+                <w:b/>
+                <w:iCs/>
+                <w:color w:val="000000"/>
+                <w:sz w:val="18"/>
+                <w:szCs w:val="20"/>
+                <w:lang w:val="en-US"/>
+              </w:rPr>
+              <w:t xml:space="preserve">{{ </w:t>
+            </w:r>
+            <w:proofErr w:type="spellStart"/>
+            <w:r>
+              <w:rPr>
+                <w:rFonts w:ascii="Tahoma" w:hAnsi="Tahoma" w:cs="Tahoma"/>
+                <w:b/>
+                <w:iCs/>
+                <w:color w:val="000000"/>
+                <w:sz w:val="18"/>
+                <w:szCs w:val="20"/>
+                <w:lang w:val="en-US"/>
+              </w:rPr>
+              <w:t>tahun_tagihan</w:t>
+            </w:r>
+            <w:proofErr w:type="spellEnd"/>
+            <w:r>
+              <w:rPr>
+                <w:rFonts w:ascii="Tahoma" w:hAnsi="Tahoma" w:cs="Tahoma"/>
+                <w:b/>
+                <w:iCs/>
+                <w:color w:val="000000"/>
+                <w:sz w:val="18"/>
+                <w:szCs w:val="20"/>
+                <w:lang w:val="en-US"/>
+              </w:rPr>
+              <w:t xml:space="preserve"> }}</w:t>
             </w:r>
           </w:p>
         </w:tc>
@@ -757,6 +1177,7 @@
               </w:rPr>
               <w:t xml:space="preserve"> </w:t>
             </w:r>
+            <w:proofErr w:type="gramStart"/>
             <w:r>
               <w:rPr>
                 <w:rFonts w:ascii="Tahoma" w:hAnsi="Tahoma" w:cs="Tahoma"/>
@@ -765,7 +1186,40 @@
                 <w:sz w:val="18"/>
                 <w:szCs w:val="20"/>
               </w:rPr>
-              <w:t>{{ sewa_price }}</w:t>
+              <w:t xml:space="preserve">{{ </w:t>
+            </w:r>
+            <w:proofErr w:type="spellStart"/>
+            <w:r>
+              <w:rPr>
+                <w:rFonts w:ascii="Tahoma" w:hAnsi="Tahoma" w:cs="Tahoma"/>
+                <w:i/>
+                <w:color w:val="000000"/>
+                <w:sz w:val="18"/>
+                <w:szCs w:val="20"/>
+              </w:rPr>
+              <w:t>sewa</w:t>
+            </w:r>
+            <w:proofErr w:type="gramEnd"/>
+            <w:r>
+              <w:rPr>
+                <w:rFonts w:ascii="Tahoma" w:hAnsi="Tahoma" w:cs="Tahoma"/>
+                <w:i/>
+                <w:color w:val="000000"/>
+                <w:sz w:val="18"/>
+                <w:szCs w:val="20"/>
+              </w:rPr>
+              <w:t>_price</w:t>
+            </w:r>
+            <w:proofErr w:type="spellEnd"/>
+            <w:r>
+              <w:rPr>
+                <w:rFonts w:ascii="Tahoma" w:hAnsi="Tahoma" w:cs="Tahoma"/>
+                <w:i/>
+                <w:color w:val="000000"/>
+                <w:sz w:val="18"/>
+                <w:szCs w:val="20"/>
+              </w:rPr>
+              <w:t xml:space="preserve"> }}</w:t>
             </w:r>
           </w:p>
         </w:tc>
@@ -849,6 +1303,7 @@
               </w:rPr>
               <w:t xml:space="preserve">Rp. </w:t>
             </w:r>
+            <w:proofErr w:type="gramStart"/>
             <w:r>
               <w:rPr>
                 <w:rFonts w:ascii="Tahoma" w:hAnsi="Tahoma" w:cs="Tahoma"/>
@@ -857,7 +1312,40 @@
                 <w:sz w:val="18"/>
                 <w:szCs w:val="20"/>
               </w:rPr>
-              <w:t>{{ parking_price }}</w:t>
+              <w:t xml:space="preserve">{{ </w:t>
+            </w:r>
+            <w:proofErr w:type="spellStart"/>
+            <w:r>
+              <w:rPr>
+                <w:rFonts w:ascii="Tahoma" w:hAnsi="Tahoma" w:cs="Tahoma"/>
+                <w:i/>
+                <w:color w:val="000000"/>
+                <w:sz w:val="18"/>
+                <w:szCs w:val="20"/>
+              </w:rPr>
+              <w:t>parking</w:t>
+            </w:r>
+            <w:proofErr w:type="gramEnd"/>
+            <w:r>
+              <w:rPr>
+                <w:rFonts w:ascii="Tahoma" w:hAnsi="Tahoma" w:cs="Tahoma"/>
+                <w:i/>
+                <w:color w:val="000000"/>
+                <w:sz w:val="18"/>
+                <w:szCs w:val="20"/>
+              </w:rPr>
+              <w:t>_price</w:t>
+            </w:r>
+            <w:proofErr w:type="spellEnd"/>
+            <w:r>
+              <w:rPr>
+                <w:rFonts w:ascii="Tahoma" w:hAnsi="Tahoma" w:cs="Tahoma"/>
+                <w:i/>
+                <w:color w:val="000000"/>
+                <w:sz w:val="18"/>
+                <w:szCs w:val="20"/>
+              </w:rPr>
+              <w:t xml:space="preserve"> }}</w:t>
             </w:r>
           </w:p>
         </w:tc>
@@ -1027,6 +1515,7 @@
               </w:rPr>
               <w:t xml:space="preserve"> </w:t>
             </w:r>
+            <w:proofErr w:type="gramStart"/>
             <w:r>
               <w:rPr>
                 <w:rFonts w:ascii="Tahoma" w:hAnsi="Tahoma" w:cs="Tahoma"/>
@@ -1036,7 +1525,43 @@
                 <w:sz w:val="18"/>
                 <w:szCs w:val="20"/>
               </w:rPr>
-              <w:t>{{ total_price }}</w:t>
+              <w:t xml:space="preserve">{{ </w:t>
+            </w:r>
+            <w:proofErr w:type="spellStart"/>
+            <w:r>
+              <w:rPr>
+                <w:rFonts w:ascii="Tahoma" w:hAnsi="Tahoma" w:cs="Tahoma"/>
+                <w:b/>
+                <w:i/>
+                <w:color w:val="000000"/>
+                <w:sz w:val="18"/>
+                <w:szCs w:val="20"/>
+              </w:rPr>
+              <w:t>total</w:t>
+            </w:r>
+            <w:proofErr w:type="gramEnd"/>
+            <w:r>
+              <w:rPr>
+                <w:rFonts w:ascii="Tahoma" w:hAnsi="Tahoma" w:cs="Tahoma"/>
+                <w:b/>
+                <w:i/>
+                <w:color w:val="000000"/>
+                <w:sz w:val="18"/>
+                <w:szCs w:val="20"/>
+              </w:rPr>
+              <w:t>_price</w:t>
+            </w:r>
+            <w:proofErr w:type="spellEnd"/>
+            <w:r>
+              <w:rPr>
+                <w:rFonts w:ascii="Tahoma" w:hAnsi="Tahoma" w:cs="Tahoma"/>
+                <w:b/>
+                <w:i/>
+                <w:color w:val="000000"/>
+                <w:sz w:val="18"/>
+                <w:szCs w:val="20"/>
+              </w:rPr>
+              <w:t xml:space="preserve"> }}</w:t>
             </w:r>
           </w:p>
         </w:tc>
@@ -1122,7 +1647,7 @@
               </wp:anchor>
             </w:drawing>
           </mc:Choice>
-          <mc:Fallback xmlns:w16sdtfl="http://schemas.microsoft.com/office/word/2024/wordml/sdtformatlock" xmlns:w16du="http://schemas.microsoft.com/office/word/2023/wordml/word16du" xmlns:oel="http://schemas.microsoft.com/office/2019/extlst">
+          <mc:Fallback xmlns:oel="http://schemas.microsoft.com/office/2019/extlst" xmlns:w16du="http://schemas.microsoft.com/office/word/2023/wordml/word16du" xmlns:w16sdtfl="http://schemas.microsoft.com/office/word/2024/wordml/sdtformatlock">
             <w:pict>
               <v:rect w14:anchorId="0F72614D" id="Rectangle 32" o:spid="_x0000_s1026" style="position:absolute;margin-left:90.25pt;margin-top:8.5pt;width:382.2pt;height:20.45pt;z-index:-251658240;visibility:visible;mso-wrap-style:square;mso-width-percent:0;mso-height-percent:0;mso-wrap-distance-left:9pt;mso-wrap-distance-top:0;mso-wrap-distance-right:9pt;mso-wrap-distance-bottom:0;mso-position-horizontal:absolute;mso-position-horizontal-relative:text;mso-position-vertical:absolute;mso-position-vertical-relative:text;mso-width-percent:0;mso-height-percent:0;mso-width-relative:page;mso-height-relative:page;v-text-anchor:top" o:gfxdata="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"/>
             </w:pict>
@@ -1140,6 +1665,7 @@
           <w:szCs w:val="20"/>
         </w:rPr>
       </w:pPr>
+      <w:proofErr w:type="spellStart"/>
       <w:r>
         <w:rPr>
           <w:rFonts w:ascii="Tahoma" w:hAnsi="Tahoma" w:cs="Tahoma"/>
@@ -1148,16 +1674,50 @@
           <w:sz w:val="18"/>
           <w:szCs w:val="20"/>
         </w:rPr>
-        <w:t>Dengan huruf</w:t>
-      </w:r>
-      <w:r>
-        <w:rPr>
-          <w:rFonts w:ascii="Tahoma" w:hAnsi="Tahoma" w:cs="Tahoma"/>
-          <w:color w:val="000000"/>
-          <w:sz w:val="18"/>
-          <w:szCs w:val="20"/>
-        </w:rPr>
-        <w:t xml:space="preserve"> : </w:t>
+        <w:t>Dengan</w:t>
+      </w:r>
+      <w:proofErr w:type="spellEnd"/>
+      <w:r>
+        <w:rPr>
+          <w:rFonts w:ascii="Tahoma" w:hAnsi="Tahoma" w:cs="Tahoma"/>
+          <w:i/>
+          <w:color w:val="000000"/>
+          <w:sz w:val="18"/>
+          <w:szCs w:val="20"/>
+        </w:rPr>
+        <w:t xml:space="preserve"> </w:t>
+      </w:r>
+      <w:proofErr w:type="spellStart"/>
+      <w:proofErr w:type="gramStart"/>
+      <w:r>
+        <w:rPr>
+          <w:rFonts w:ascii="Tahoma" w:hAnsi="Tahoma" w:cs="Tahoma"/>
+          <w:i/>
+          <w:color w:val="000000"/>
+          <w:sz w:val="18"/>
+          <w:szCs w:val="20"/>
+        </w:rPr>
+        <w:t>huruf</w:t>
+      </w:r>
+      <w:proofErr w:type="spellEnd"/>
+      <w:r>
+        <w:rPr>
+          <w:rFonts w:ascii="Tahoma" w:hAnsi="Tahoma" w:cs="Tahoma"/>
+          <w:color w:val="000000"/>
+          <w:sz w:val="18"/>
+          <w:szCs w:val="20"/>
+        </w:rPr>
+        <w:t xml:space="preserve"> :</w:t>
+      </w:r>
+      <w:proofErr w:type="gramEnd"/>
+      <w:r>
+        <w:rPr>
+          <w:rFonts w:ascii="Tahoma" w:hAnsi="Tahoma" w:cs="Tahoma"/>
+          <w:color w:val="000000"/>
+          <w:sz w:val="18"/>
+          <w:szCs w:val="20"/>
+        </w:rPr>
+        <w:t xml:space="preserve"> </w:t>
       </w:r>
       <w:r>
         <w:rPr>
@@ -1176,7 +1736,29 @@
           <w:sz w:val="20"/>
           <w:szCs w:val="20"/>
         </w:rPr>
-        <w:t>{{ total_price_words }}</w:t>
+        <w:t xml:space="preserve">{{ </w:t>
+      </w:r>
+      <w:proofErr w:type="spellStart"/>
+      <w:r>
+        <w:rPr>
+          <w:rFonts w:ascii="Tahoma" w:hAnsi="Tahoma" w:cs="Tahoma"/>
+          <w:b/>
+          <w:color w:val="000000"/>
+          <w:sz w:val="20"/>
+          <w:szCs w:val="20"/>
+        </w:rPr>
+        <w:t>total_price_words</w:t>
+      </w:r>
+      <w:proofErr w:type="spellEnd"/>
+      <w:r>
+        <w:rPr>
+          <w:rFonts w:ascii="Tahoma" w:hAnsi="Tahoma" w:cs="Tahoma"/>
+          <w:b/>
+          <w:color w:val="000000"/>
+          <w:sz w:val="20"/>
+          <w:szCs w:val="20"/>
+        </w:rPr>
+        <w:t xml:space="preserve"> }}</w:t>
       </w:r>
     </w:p>
     <w:p>
@@ -1239,6 +1821,8 @@
                 <w:szCs w:val="16"/>
               </w:rPr>
             </w:pPr>
+            <w:proofErr w:type="spellStart"/>
+            <w:proofErr w:type="gramStart"/>
             <w:r>
               <w:rPr>
                 <w:rFonts w:ascii="Tahoma" w:hAnsi="Tahoma" w:cs="Tahoma"/>
@@ -1247,8 +1831,20 @@
                 <w:sz w:val="16"/>
                 <w:szCs w:val="16"/>
               </w:rPr>
-              <w:t>Catatan :</w:t>
-            </w:r>
+              <w:t>Catatan</w:t>
+            </w:r>
+            <w:proofErr w:type="spellEnd"/>
+            <w:r>
+              <w:rPr>
+                <w:rFonts w:ascii="Tahoma" w:hAnsi="Tahoma" w:cs="Tahoma"/>
+                <w:b/>
+                <w:color w:val="000000"/>
+                <w:sz w:val="16"/>
+                <w:szCs w:val="16"/>
+              </w:rPr>
+              <w:t xml:space="preserve"> :</w:t>
+            </w:r>
+            <w:proofErr w:type="gramEnd"/>
           </w:p>
           <w:p>
             <w:pPr>
@@ -1430,24 +2026,6 @@
               <w:t>Setelah melakukan pembayaran segera menukarkan slip BJB kepada petugas Pengelola Rusunawa.</w:t>
             </w:r>
           </w:p>
-          <w:p>
-            <w:pPr>
-              <w:pStyle w:val="BodyTextIndent2"/>
-              <w:tabs>
-                <w:tab w:val="clear" w:pos="1653"/>
-                <w:tab w:val="left" w:pos="284"/>
-              </w:tabs>
-              <w:spacing w:after="0"/>
-              <w:ind w:left="0" w:firstLine="0"/>
-              <w:rPr>
-                <w:rFonts w:ascii="Tahoma" w:hAnsi="Tahoma" w:cs="Tahoma"/>
-                <w:color w:val="00B050"/>
-                <w:sz w:val="16"/>
-                <w:szCs w:val="16"/>
-                <w:lang w:val="en-US"/>
-              </w:rPr>
-            </w:pPr>
-          </w:p>
         </w:tc>
         <w:tc>
           <w:tcPr>
@@ -1464,6 +2042,7 @@
                 <w:lang w:val="en-US"/>
               </w:rPr>
             </w:pPr>
+            <w:proofErr w:type="spellStart"/>
             <w:r>
               <w:rPr>
                 <w:rFonts w:ascii="Tahoma" w:hAnsi="Tahoma" w:cs="Tahoma"/>
@@ -1471,8 +2050,9 @@
                 <w:szCs w:val="18"/>
                 <w:lang w:val="en-US"/>
               </w:rPr>
-              <w:t xml:space="preserve">Cimahi, </w:t>
-            </w:r>
+              <w:t>Cimahi</w:t>
+            </w:r>
+            <w:proofErr w:type="spellEnd"/>
             <w:r>
               <w:rPr>
                 <w:rFonts w:ascii="Tahoma" w:hAnsi="Tahoma" w:cs="Tahoma"/>
@@ -1480,7 +2060,7 @@
                 <w:szCs w:val="18"/>
                 <w:lang w:val="en-US"/>
               </w:rPr>
-              <w:t>0</w:t>
+              <w:t xml:space="preserve">, </w:t>
             </w:r>
             <w:r>
               <w:rPr>
@@ -1489,7 +2069,7 @@
                 <w:szCs w:val="18"/>
                 <w:lang w:val="en-US"/>
               </w:rPr>
-              <w:t>1</w:t>
+              <w:t>0</w:t>
             </w:r>
             <w:r>
               <w:rPr>
@@ -1498,8 +2078,18 @@
                 <w:szCs w:val="18"/>
                 <w:lang w:val="en-US"/>
               </w:rPr>
+              <w:t>1</w:t>
+            </w:r>
+            <w:r>
+              <w:rPr>
+                <w:rFonts w:ascii="Tahoma" w:hAnsi="Tahoma" w:cs="Tahoma"/>
+                <w:sz w:val="18"/>
+                <w:szCs w:val="18"/>
+                <w:lang w:val="en-US"/>
+              </w:rPr>
               <w:t xml:space="preserve"> </w:t>
             </w:r>
+            <w:proofErr w:type="gramStart"/>
             <w:r>
               <w:rPr>
                 <w:rFonts w:ascii="Tahoma" w:hAnsi="Tahoma" w:cs="Tahoma"/>
@@ -1510,7 +2100,72 @@
                 <w:szCs w:val="20"/>
                 <w:lang w:val="en-US"/>
               </w:rPr>
-              <w:t>{{ bulan_tagihan }} {{ tahun_tagihan }}</w:t>
+              <w:t xml:space="preserve">{{ </w:t>
+            </w:r>
+            <w:proofErr w:type="spellStart"/>
+            <w:r>
+              <w:rPr>
+                <w:rFonts w:ascii="Tahoma" w:hAnsi="Tahoma" w:cs="Tahoma"/>
+                <w:bCs/>
+                <w:iCs/>
+                <w:color w:val="000000"/>
+                <w:sz w:val="18"/>
+                <w:szCs w:val="20"/>
+                <w:lang w:val="en-US"/>
+              </w:rPr>
+              <w:t>bulan</w:t>
+            </w:r>
+            <w:proofErr w:type="gramEnd"/>
+            <w:r>
+              <w:rPr>
+                <w:rFonts w:ascii="Tahoma" w:hAnsi="Tahoma" w:cs="Tahoma"/>
+                <w:bCs/>
+                <w:iCs/>
+                <w:color w:val="000000"/>
+                <w:sz w:val="18"/>
+                <w:szCs w:val="20"/>
+                <w:lang w:val="en-US"/>
+              </w:rPr>
+              <w:t>_tagihan</w:t>
+            </w:r>
+            <w:proofErr w:type="spellEnd"/>
+            <w:r>
+              <w:rPr>
+                <w:rFonts w:ascii="Tahoma" w:hAnsi="Tahoma" w:cs="Tahoma"/>
+                <w:bCs/>
+                <w:iCs/>
+                <w:color w:val="000000"/>
+                <w:sz w:val="18"/>
+                <w:szCs w:val="20"/>
+                <w:lang w:val="en-US"/>
+              </w:rPr>
+              <w:t xml:space="preserve"> }} {{ </w:t>
+            </w:r>
+            <w:proofErr w:type="spellStart"/>
+            <w:r>
+              <w:rPr>
+                <w:rFonts w:ascii="Tahoma" w:hAnsi="Tahoma" w:cs="Tahoma"/>
+                <w:bCs/>
+                <w:iCs/>
+                <w:color w:val="000000"/>
+                <w:sz w:val="18"/>
+                <w:szCs w:val="20"/>
+                <w:lang w:val="en-US"/>
+              </w:rPr>
+              <w:t>tahun_tagihan</w:t>
+            </w:r>
+            <w:proofErr w:type="spellEnd"/>
+            <w:r>
+              <w:rPr>
+                <w:rFonts w:ascii="Tahoma" w:hAnsi="Tahoma" w:cs="Tahoma"/>
+                <w:bCs/>
+                <w:iCs/>
+                <w:color w:val="000000"/>
+                <w:sz w:val="18"/>
+                <w:szCs w:val="20"/>
+                <w:lang w:val="en-US"/>
+              </w:rPr>
+              <w:t xml:space="preserve"> }}</w:t>
             </w:r>
           </w:p>
           <w:p>
@@ -1587,6 +2242,21 @@
               <w:spacing w:after="0"/>
               <w:ind w:left="1170" w:firstLine="0"/>
               <w:jc w:val="center"/>
+              <w:rPr>
+                <w:rFonts w:ascii="Tahoma" w:hAnsi="Tahoma" w:cs="Tahoma"/>
+                <w:sz w:val="18"/>
+                <w:szCs w:val="18"/>
+              </w:rPr>
+            </w:pPr>
+          </w:p>
+          <w:p>
+            <w:pPr>
+              <w:pStyle w:val="BodyTextIndent2"/>
+              <w:tabs>
+                <w:tab w:val="clear" w:pos="1653"/>
+                <w:tab w:val="left" w:pos="1080"/>
+              </w:tabs>
+              <w:spacing w:after="0"/>
               <w:rPr>
                 <w:rFonts w:ascii="Tahoma" w:hAnsi="Tahoma" w:cs="Tahoma"/>
                 <w:sz w:val="18"/>
@@ -1623,10 +2293,56 @@
               <w:jc w:val="center"/>
               <w:rPr>
                 <w:rFonts w:ascii="Tahoma" w:hAnsi="Tahoma" w:cs="Tahoma"/>
+                <w:b/>
                 <w:sz w:val="18"/>
                 <w:szCs w:val="18"/>
+                <w:lang w:val="en-US"/>
               </w:rPr>
             </w:pPr>
+            <w:proofErr w:type="gramStart"/>
+            <w:r>
+              <w:rPr>
+                <w:rFonts w:ascii="Tahoma" w:hAnsi="Tahoma" w:cs="Tahoma"/>
+                <w:b/>
+                <w:sz w:val="18"/>
+                <w:szCs w:val="18"/>
+                <w:lang w:val="en-US"/>
+              </w:rPr>
+              <w:t xml:space="preserve">{{ </w:t>
+            </w:r>
+            <w:proofErr w:type="spellStart"/>
+            <w:r>
+              <w:rPr>
+                <w:rFonts w:ascii="Tahoma" w:hAnsi="Tahoma" w:cs="Tahoma"/>
+                <w:b/>
+                <w:sz w:val="18"/>
+                <w:szCs w:val="18"/>
+                <w:lang w:val="en-US"/>
+              </w:rPr>
+              <w:t>nama</w:t>
+            </w:r>
+            <w:proofErr w:type="gramEnd"/>
+            <w:r>
+              <w:rPr>
+                <w:rFonts w:ascii="Tahoma" w:hAnsi="Tahoma" w:cs="Tahoma"/>
+                <w:b/>
+                <w:sz w:val="18"/>
+                <w:szCs w:val="18"/>
+                <w:lang w:val="en-US"/>
+              </w:rPr>
+              <w:t>_pejabat</w:t>
+            </w:r>
+            <w:proofErr w:type="spellEnd"/>
+            <w:r>
+              <w:rPr>
+                <w:rFonts w:ascii="Tahoma" w:hAnsi="Tahoma" w:cs="Tahoma"/>
+                <w:b/>
+                <w:sz w:val="18"/>
+                <w:szCs w:val="18"/>
+                <w:lang w:val="en-US"/>
+              </w:rPr>
+              <w:t xml:space="preserve"> }}</w:t>
+            </w:r>
           </w:p>
           <w:p>
             <w:pPr>
@@ -1640,21 +2356,50 @@
               <w:jc w:val="center"/>
               <w:rPr>
                 <w:rFonts w:ascii="Tahoma" w:hAnsi="Tahoma" w:cs="Tahoma"/>
-                <w:b/>
                 <w:sz w:val="18"/>
                 <w:szCs w:val="18"/>
                 <w:lang w:val="en-US"/>
               </w:rPr>
             </w:pPr>
-            <w:r>
-              <w:rPr>
-                <w:rFonts w:ascii="Tahoma" w:hAnsi="Tahoma" w:cs="Tahoma"/>
-                <w:b/>
+            <w:proofErr w:type="gramStart"/>
+            <w:r>
+              <w:rPr>
+                <w:rFonts w:ascii="Tahoma" w:hAnsi="Tahoma" w:cs="Tahoma"/>
                 <w:sz w:val="18"/>
                 <w:szCs w:val="18"/>
                 <w:lang w:val="en-US"/>
               </w:rPr>
-              <w:t>{{ nama_pejabat }}</w:t>
+              <w:t xml:space="preserve">{{ </w:t>
+            </w:r>
+            <w:proofErr w:type="spellStart"/>
+            <w:r>
+              <w:rPr>
+                <w:rFonts w:ascii="Tahoma" w:hAnsi="Tahoma" w:cs="Tahoma"/>
+                <w:sz w:val="18"/>
+                <w:szCs w:val="18"/>
+                <w:lang w:val="en-US"/>
+              </w:rPr>
+              <w:t>pangkat</w:t>
+            </w:r>
+            <w:proofErr w:type="gramEnd"/>
+            <w:r>
+              <w:rPr>
+                <w:rFonts w:ascii="Tahoma" w:hAnsi="Tahoma" w:cs="Tahoma"/>
+                <w:sz w:val="18"/>
+                <w:szCs w:val="18"/>
+                <w:lang w:val="en-US"/>
+              </w:rPr>
+              <w:t>_pejabat</w:t>
+            </w:r>
+            <w:proofErr w:type="spellEnd"/>
+            <w:r>
+              <w:rPr>
+                <w:rFonts w:ascii="Tahoma" w:hAnsi="Tahoma" w:cs="Tahoma"/>
+                <w:sz w:val="18"/>
+                <w:szCs w:val="18"/>
+                <w:lang w:val="en-US"/>
+              </w:rPr>
+              <w:t xml:space="preserve"> }}</w:t>
             </w:r>
           </w:p>
           <w:p>
@@ -1669,39 +2414,35 @@
               <w:jc w:val="center"/>
               <w:rPr>
                 <w:rFonts w:ascii="Tahoma" w:hAnsi="Tahoma" w:cs="Tahoma"/>
+                <w:color w:val="000000"/>
+                <w:sz w:val="18"/>
+                <w:szCs w:val="18"/>
+                <w:lang w:val="id-ID"/>
+              </w:rPr>
+            </w:pPr>
+            <w:proofErr w:type="gramStart"/>
+            <w:r>
+              <w:rPr>
+                <w:rFonts w:ascii="Tahoma" w:hAnsi="Tahoma" w:cs="Tahoma"/>
+                <w:color w:val="000000"/>
                 <w:sz w:val="18"/>
                 <w:szCs w:val="18"/>
                 <w:lang w:val="en-US"/>
               </w:rPr>
-            </w:pPr>
-            <w:r>
-              <w:rPr>
-                <w:rFonts w:ascii="Tahoma" w:hAnsi="Tahoma" w:cs="Tahoma"/>
+              <w:t xml:space="preserve">{{ </w:t>
+            </w:r>
+            <w:proofErr w:type="spellStart"/>
+            <w:r>
+              <w:rPr>
+                <w:rFonts w:ascii="Tahoma" w:hAnsi="Tahoma" w:cs="Tahoma"/>
+                <w:color w:val="000000"/>
                 <w:sz w:val="18"/>
                 <w:szCs w:val="18"/>
                 <w:lang w:val="en-US"/>
               </w:rPr>
-              <w:t>{{ pangkat_pejabat }}</w:t>
-            </w:r>
-          </w:p>
-          <w:p>
-            <w:pPr>
-              <w:pStyle w:val="BodyTextIndent2"/>
-              <w:tabs>
-                <w:tab w:val="clear" w:pos="1653"/>
-                <w:tab w:val="left" w:pos="1080"/>
-              </w:tabs>
-              <w:spacing w:after="0"/>
-              <w:ind w:left="1170" w:firstLine="0"/>
-              <w:jc w:val="center"/>
-              <w:rPr>
-                <w:rFonts w:ascii="Tahoma" w:hAnsi="Tahoma" w:cs="Tahoma"/>
-                <w:color w:val="000000"/>
-                <w:sz w:val="18"/>
-                <w:szCs w:val="18"/>
-                <w:lang w:val="id-ID"/>
-              </w:rPr>
-            </w:pPr>
+              <w:t>nip</w:t>
+            </w:r>
+            <w:proofErr w:type="gramEnd"/>
             <w:r>
               <w:rPr>
                 <w:rFonts w:ascii="Tahoma" w:hAnsi="Tahoma" w:cs="Tahoma"/>
@@ -1710,8 +2451,9 @@
                 <w:szCs w:val="18"/>
                 <w:lang w:val="en-US"/>
               </w:rPr>
-              <w:t xml:space="preserve">NIP. </w:t>
-            </w:r>
+              <w:t>_pejabat</w:t>
+            </w:r>
+            <w:proofErr w:type="spellEnd"/>
             <w:r>
               <w:rPr>
                 <w:rFonts w:ascii="Tahoma" w:hAnsi="Tahoma" w:cs="Tahoma"/>
@@ -1720,7 +2462,7 @@
                 <w:szCs w:val="18"/>
                 <w:lang w:val="en-US"/>
               </w:rPr>
-              <w:t>{{ nip_pejabat }}</w:t>
+              <w:t xml:space="preserve"> }}</w:t>
             </w:r>
           </w:p>
         </w:tc>
@@ -1781,7 +2523,7 @@
     <w:sectPr>
       <w:headerReference w:type="default" r:id="rId12"/>
       <w:pgSz w:w="11906" w:h="8391" w:orient="landscape" w:code="11"/>
-      <w:pgMar w:top="1253" w:right="0" w:bottom="50" w:left="0" w:header="706" w:footer="706" w:gutter="0"/>
+      <w:pgMar w:top="142" w:right="0" w:bottom="50" w:left="0" w:header="706" w:footer="706" w:gutter="0"/>
       <w:cols w:space="708"/>
       <w:docGrid w:linePitch="360"/>
     </w:sectPr>

</xml_diff>